<commit_message>
Update PN532 guide with dual-mode loop for iPhone + card support
Added detailed dual-mode loop specification: Target mode first (500ms)
for iPhone, then Reader mode briefly (20ms) for NFC cards. Explains
why Target mode must be first (PN532 RF triggers Apple Wallet), timing
ratios (96% target / 4% reader), communication steps, data format,
3-step write process, and troubleshooting table.

Co-Authored-By: Claude Opus 4.6 <noreply@anthropic.com>
</commit_message>
<xml_diff>
--- a/PN532_Embedded_Team_Guide.docx
+++ b/PN532_Embedded_Team_Guide.docx
@@ -2,17 +2,13 @@
 <file path=word/document.xml><?xml version="1.0" encoding="utf-8"?>
 <w:document xmlns:wpc="http://schemas.microsoft.com/office/word/2010/wordprocessingCanvas" xmlns:mo="http://schemas.microsoft.com/office/mac/office/2008/main" xmlns:mc="http://schemas.openxmlformats.org/markup-compatibility/2006" xmlns:mv="urn:schemas-microsoft-com:mac:vml" xmlns:o="urn:schemas-microsoft-com:office:office" xmlns:r="http://schemas.openxmlformats.org/officeDocument/2006/relationships" xmlns:m="http://schemas.openxmlformats.org/officeDocument/2006/math" xmlns:v="urn:schemas-microsoft-com:vml" xmlns:wp14="http://schemas.microsoft.com/office/word/2010/wordprocessingDrawing" xmlns:wp="http://schemas.openxmlformats.org/drawingml/2006/wordprocessingDrawing" xmlns:w10="urn:schemas-microsoft-com:office:word" xmlns:w="http://schemas.openxmlformats.org/wordprocessingml/2006/main" xmlns:w14="http://schemas.microsoft.com/office/word/2010/wordml" xmlns:wpg="http://schemas.microsoft.com/office/word/2010/wordprocessingGroup" xmlns:wpi="http://schemas.microsoft.com/office/word/2010/wordprocessingInk" xmlns:wne="http://schemas.microsoft.com/office/word/2006/wordml" xmlns:wps="http://schemas.microsoft.com/office/word/2010/wordprocessingShape" mc:Ignorable="w14 wp14">
   <w:body>
-    <w:p/>
     <w:p>
       <w:pPr>
         <w:pStyle w:val="Title"/>
+        <w:jc w:val="center"/>
       </w:pPr>
       <w:r>
-        <w:rPr>
-          <w:color w:val="1A73E8"/>
-          <w:sz w:val="56"/>
-        </w:rPr>
-        <w:t>PN532 Reader — Integration Guide</w:t>
+        <w:t>PN532 Embedded Team Guide</w:t>
       </w:r>
     </w:p>
     <w:p>
@@ -20,11 +16,7 @@
         <w:jc w:val="center"/>
       </w:pPr>
       <w:r>
-        <w:rPr>
-          <w:color w:val="86868B"/>
-          <w:sz w:val="28"/>
-        </w:rPr>
-        <w:t>What the Embedded Team Needs to Know</w:t>
+        <w:t>NFC Door Access — iPhone Integration</w:t>
       </w:r>
     </w:p>
     <w:p>
@@ -32,16 +24,28 @@
         <w:jc w:val="center"/>
       </w:pPr>
       <w:r>
-        <w:rPr>
-          <w:color w:val="86868B"/>
-          <w:sz w:val="22"/>
-        </w:rPr>
-        <w:t>Module: PN532 V3  |  Version 1.0  |  February 2026</w:t>
+        <w:t>Updated: March 2026 — v3 (Dual-Mode Loop)</w:t>
+      </w:r>
+    </w:p>
+    <w:p/>
+    <w:p>
+      <w:pPr>
+        <w:pStyle w:val="Heading1"/>
+      </w:pPr>
+      <w:r>
+        <w:t>1. What the Reader Must Do</w:t>
       </w:r>
     </w:p>
     <w:p>
       <w:r>
-        <w:br w:type="page"/>
+        <w:t>The PN532 reader has TWO jobs:</w:t>
+        <w:br/>
+        <w:t>• Read physical NFC hotel cards (Reader Mode)</w:t>
+        <w:br/>
+        <w:t>• Receive data from iPhone app (Target Mode)</w:t>
+        <w:br/>
+        <w:br/>
+        <w:t>It CANNOT do both at the same time. It must rapidly switch between the two modes using a Dual-Mode Loop.</w:t>
       </w:r>
     </w:p>
     <w:p>
@@ -49,160 +53,23 @@
         <w:pStyle w:val="Heading1"/>
       </w:pPr>
       <w:r>
-        <w:rPr>
-          <w:color w:val="1A73E8"/>
-        </w:rPr>
-        <w:t>1. What You Need to Do (Summary)</w:t>
+        <w:t>2. Why Dual-Mode Is Required</w:t>
       </w:r>
     </w:p>
     <w:p>
       <w:r>
-        <w:t>Your PN532 reader must support TWO modes so it works with both iPhone and Android:</w:t>
-      </w:r>
-    </w:p>
-    <w:tbl>
-      <w:tblPr>
-        <w:tblStyle w:val="LightGrid-Accent1"/>
-        <w:tblW w:type="auto" w:w="0"/>
-        <w:jc w:val="center"/>
-        <w:tblLook w:firstColumn="1" w:firstRow="1" w:lastColumn="0" w:lastRow="0" w:noHBand="0" w:noVBand="1" w:val="04A0"/>
-      </w:tblPr>
-      <w:tblGrid>
-        <w:gridCol w:w="2880"/>
-        <w:gridCol w:w="2880"/>
-        <w:gridCol w:w="2880"/>
-      </w:tblGrid>
-      <w:tr>
-        <w:tc>
-          <w:tcPr>
-            <w:tcW w:type="dxa" w:w="2880"/>
-          </w:tcPr>
-          <w:p>
-            <w:r>
-              <w:rPr>
-                <w:b/>
-                <w:sz w:val="20"/>
-              </w:rPr>
-              <w:t>Mode</w:t>
-            </w:r>
-          </w:p>
-        </w:tc>
-        <w:tc>
-          <w:tcPr>
-            <w:tcW w:type="dxa" w:w="2880"/>
-          </w:tcPr>
-          <w:p>
-            <w:r>
-              <w:rPr>
-                <w:b/>
-                <w:sz w:val="20"/>
-              </w:rPr>
-              <w:t>For Which Phone</w:t>
-            </w:r>
-          </w:p>
-        </w:tc>
-        <w:tc>
-          <w:tcPr>
-            <w:tcW w:type="dxa" w:w="2880"/>
-          </w:tcPr>
-          <w:p>
-            <w:r>
-              <w:rPr>
-                <w:b/>
-                <w:sz w:val="20"/>
-              </w:rPr>
-              <w:t>What PN532 Does</w:t>
-            </w:r>
-          </w:p>
-        </w:tc>
-      </w:tr>
-      <w:tr>
-        <w:tc>
-          <w:tcPr>
-            <w:tcW w:type="dxa" w:w="2880"/>
-          </w:tcPr>
-          <w:p>
-            <w:r>
-              <w:rPr>
-                <w:sz w:val="20"/>
-              </w:rPr>
-              <w:t>Tag Mode (Target)</w:t>
-            </w:r>
-          </w:p>
-        </w:tc>
-        <w:tc>
-          <w:tcPr>
-            <w:tcW w:type="dxa" w:w="2880"/>
-          </w:tcPr>
-          <w:p>
-            <w:r>
-              <w:rPr>
-                <w:sz w:val="20"/>
-              </w:rPr>
-              <w:t>iPhone</w:t>
-            </w:r>
-          </w:p>
-        </w:tc>
-        <w:tc>
-          <w:tcPr>
-            <w:tcW w:type="dxa" w:w="2880"/>
-          </w:tcPr>
-          <w:p>
-            <w:r>
-              <w:rPr>
-                <w:sz w:val="20"/>
-              </w:rPr>
-              <w:t>Pretends to be an NFC tag. iPhone writes data TO the reader.</w:t>
-            </w:r>
-          </w:p>
-        </w:tc>
-      </w:tr>
-      <w:tr>
-        <w:tc>
-          <w:tcPr>
-            <w:tcW w:type="dxa" w:w="2880"/>
-          </w:tcPr>
-          <w:p>
-            <w:r>
-              <w:rPr>
-                <w:sz w:val="20"/>
-              </w:rPr>
-              <w:t>Reader Mode (Initiator)</w:t>
-            </w:r>
-          </w:p>
-        </w:tc>
-        <w:tc>
-          <w:tcPr>
-            <w:tcW w:type="dxa" w:w="2880"/>
-          </w:tcPr>
-          <w:p>
-            <w:r>
-              <w:rPr>
-                <w:sz w:val="20"/>
-              </w:rPr>
-              <w:t>Android</w:t>
-            </w:r>
-          </w:p>
-        </w:tc>
-        <w:tc>
-          <w:tcPr>
-            <w:tcW w:type="dxa" w:w="2880"/>
-          </w:tcPr>
-          <w:p>
-            <w:r>
-              <w:rPr>
-                <w:sz w:val="20"/>
-              </w:rPr>
-              <w:t>Acts as normal reader. Reads data FROM the Android phone.</w:t>
-            </w:r>
-          </w:p>
-        </w:tc>
-      </w:tr>
-    </w:tbl>
-    <w:p/>
-    <w:p>
-      <w:r>
-        <w:t>In both cases, the reader receives the SAME JSON data with the same 5 fields. Only the communication direction is different.</w:t>
+        <w:t>Apple iPhone has a hardware-level rule that CANNOT be changed by any app:</w:t>
+        <w:br/>
+        <w:br/>
+        <w:t>• When iPhone detects an external RF field → iOS opens Apple Wallet</w:t>
+        <w:br/>
+        <w:t>• When iPhone generates RF and finds a tag → iOS routes to the app</w:t>
+        <w:br/>
+        <w:br/>
+        <w:t>If the PN532 stays in Reader Mode (generating RF), the iPhone will ALWAYS open Wallet instead of the door access app. No iOS code can prevent this.</w:t>
+        <w:br/>
+        <w:br/>
+        <w:t>The PN532 must be in Target Mode (silent, no RF) when the iPhone taps. The iPhone generates the RF field and the PN532 responds as a tag.</w:t>
       </w:r>
     </w:p>
     <w:p>
@@ -210,975 +77,12 @@
         <w:pStyle w:val="Heading1"/>
       </w:pPr>
       <w:r>
-        <w:rPr>
-          <w:color w:val="1A73E8"/>
-        </w:rPr>
-        <w:t>2. How iPhone Sends Data to the Reader</w:t>
-      </w:r>
-    </w:p>
-    <w:p>
-      <w:pPr>
-        <w:pStyle w:val="Heading2"/>
-      </w:pPr>
-      <w:r>
-        <w:rPr>
-          <w:color w:val="1A73E8"/>
-        </w:rPr>
-        <w:t>Overview</w:t>
+        <w:t>3. The Dual-Mode Loop</w:t>
       </w:r>
     </w:p>
     <w:p>
       <w:r>
-        <w:t>The iPhone cannot act as an NFC card (Apple blocks this). Instead, the iPhone acts as an NFC writer and the PN532 acts as a tag. The iPhone writes the guest data to the reader, then the reader processes it.</w:t>
-      </w:r>
-    </w:p>
-    <w:p>
-      <w:pPr>
-        <w:pStyle w:val="Heading2"/>
-      </w:pPr>
-      <w:r>
-        <w:rPr>
-          <w:color w:val="1A73E8"/>
-        </w:rPr>
-        <w:t>Communication Steps</w:t>
-      </w:r>
-    </w:p>
-    <w:tbl>
-      <w:tblPr>
-        <w:tblStyle w:val="LightGrid-Accent1"/>
-        <w:tblW w:type="auto" w:w="0"/>
-        <w:jc w:val="center"/>
-        <w:tblLook w:firstColumn="1" w:firstRow="1" w:lastColumn="0" w:lastRow="0" w:noHBand="0" w:noVBand="1" w:val="04A0"/>
-      </w:tblPr>
-      <w:tblGrid>
-        <w:gridCol w:w="2880"/>
-        <w:gridCol w:w="2880"/>
-        <w:gridCol w:w="2880"/>
-      </w:tblGrid>
-      <w:tr>
-        <w:tc>
-          <w:tcPr>
-            <w:tcW w:type="dxa" w:w="2880"/>
-          </w:tcPr>
-          <w:p>
-            <w:r>
-              <w:rPr>
-                <w:b/>
-                <w:sz w:val="20"/>
-              </w:rPr>
-              <w:t>Step</w:t>
-            </w:r>
-          </w:p>
-        </w:tc>
-        <w:tc>
-          <w:tcPr>
-            <w:tcW w:type="dxa" w:w="2880"/>
-          </w:tcPr>
-          <w:p>
-            <w:r>
-              <w:rPr>
-                <w:b/>
-                <w:sz w:val="20"/>
-              </w:rPr>
-              <w:t>What Happens</w:t>
-            </w:r>
-          </w:p>
-        </w:tc>
-        <w:tc>
-          <w:tcPr>
-            <w:tcW w:type="dxa" w:w="2880"/>
-          </w:tcPr>
-          <w:p>
-            <w:r>
-              <w:rPr>
-                <w:b/>
-                <w:sz w:val="20"/>
-              </w:rPr>
-              <w:t>Who Does It</w:t>
-            </w:r>
-          </w:p>
-        </w:tc>
-      </w:tr>
-      <w:tr>
-        <w:tc>
-          <w:tcPr>
-            <w:tcW w:type="dxa" w:w="2880"/>
-          </w:tcPr>
-          <w:p>
-            <w:r>
-              <w:rPr>
-                <w:sz w:val="20"/>
-              </w:rPr>
-              <w:t>1</w:t>
-            </w:r>
-          </w:p>
-        </w:tc>
-        <w:tc>
-          <w:tcPr>
-            <w:tcW w:type="dxa" w:w="2880"/>
-          </w:tcPr>
-          <w:p>
-            <w:r>
-              <w:rPr>
-                <w:sz w:val="20"/>
-              </w:rPr>
-              <w:t>Guest taps "Unlock" on iPhone</w:t>
-            </w:r>
-          </w:p>
-        </w:tc>
-        <w:tc>
-          <w:tcPr>
-            <w:tcW w:type="dxa" w:w="2880"/>
-          </w:tcPr>
-          <w:p>
-            <w:r>
-              <w:rPr>
-                <w:sz w:val="20"/>
-              </w:rPr>
-              <w:t>iPhone</w:t>
-            </w:r>
-          </w:p>
-        </w:tc>
-      </w:tr>
-      <w:tr>
-        <w:tc>
-          <w:tcPr>
-            <w:tcW w:type="dxa" w:w="2880"/>
-          </w:tcPr>
-          <w:p>
-            <w:r>
-              <w:rPr>
-                <w:sz w:val="20"/>
-              </w:rPr>
-              <w:t>2</w:t>
-            </w:r>
-          </w:p>
-        </w:tc>
-        <w:tc>
-          <w:tcPr>
-            <w:tcW w:type="dxa" w:w="2880"/>
-          </w:tcPr>
-          <w:p>
-            <w:r>
-              <w:rPr>
-                <w:sz w:val="20"/>
-              </w:rPr>
-              <w:t>iPhone turns on NFC and scans for tags</w:t>
-            </w:r>
-          </w:p>
-        </w:tc>
-        <w:tc>
-          <w:tcPr>
-            <w:tcW w:type="dxa" w:w="2880"/>
-          </w:tcPr>
-          <w:p>
-            <w:r>
-              <w:rPr>
-                <w:sz w:val="20"/>
-              </w:rPr>
-              <w:t>iPhone</w:t>
-            </w:r>
-          </w:p>
-        </w:tc>
-      </w:tr>
-      <w:tr>
-        <w:tc>
-          <w:tcPr>
-            <w:tcW w:type="dxa" w:w="2880"/>
-          </w:tcPr>
-          <w:p>
-            <w:r>
-              <w:rPr>
-                <w:sz w:val="20"/>
-              </w:rPr>
-              <w:t>3</w:t>
-            </w:r>
-          </w:p>
-        </w:tc>
-        <w:tc>
-          <w:tcPr>
-            <w:tcW w:type="dxa" w:w="2880"/>
-          </w:tcPr>
-          <w:p>
-            <w:r>
-              <w:rPr>
-                <w:sz w:val="20"/>
-              </w:rPr>
-              <w:t>PN532 (in Tag Mode) responds to the scan</w:t>
-            </w:r>
-          </w:p>
-        </w:tc>
-        <w:tc>
-          <w:tcPr>
-            <w:tcW w:type="dxa" w:w="2880"/>
-          </w:tcPr>
-          <w:p>
-            <w:r>
-              <w:rPr>
-                <w:sz w:val="20"/>
-              </w:rPr>
-              <w:t>Reader</w:t>
-            </w:r>
-          </w:p>
-        </w:tc>
-      </w:tr>
-      <w:tr>
-        <w:tc>
-          <w:tcPr>
-            <w:tcW w:type="dxa" w:w="2880"/>
-          </w:tcPr>
-          <w:p>
-            <w:r>
-              <w:rPr>
-                <w:sz w:val="20"/>
-              </w:rPr>
-              <w:t>4</w:t>
-            </w:r>
-          </w:p>
-        </w:tc>
-        <w:tc>
-          <w:tcPr>
-            <w:tcW w:type="dxa" w:w="2880"/>
-          </w:tcPr>
-          <w:p>
-            <w:r>
-              <w:rPr>
-                <w:sz w:val="20"/>
-              </w:rPr>
-              <w:t>iPhone asks: "What are your capabilities?"</w:t>
-            </w:r>
-          </w:p>
-        </w:tc>
-        <w:tc>
-          <w:tcPr>
-            <w:tcW w:type="dxa" w:w="2880"/>
-          </w:tcPr>
-          <w:p>
-            <w:r>
-              <w:rPr>
-                <w:sz w:val="20"/>
-              </w:rPr>
-              <w:t>iPhone</w:t>
-            </w:r>
-          </w:p>
-        </w:tc>
-      </w:tr>
-      <w:tr>
-        <w:tc>
-          <w:tcPr>
-            <w:tcW w:type="dxa" w:w="2880"/>
-          </w:tcPr>
-          <w:p>
-            <w:r>
-              <w:rPr>
-                <w:sz w:val="20"/>
-              </w:rPr>
-              <w:t>5</w:t>
-            </w:r>
-          </w:p>
-        </w:tc>
-        <w:tc>
-          <w:tcPr>
-            <w:tcW w:type="dxa" w:w="2880"/>
-          </w:tcPr>
-          <w:p>
-            <w:r>
-              <w:rPr>
-                <w:sz w:val="20"/>
-              </w:rPr>
-              <w:t>Reader responds: "1024 bytes, read/write open"</w:t>
-            </w:r>
-          </w:p>
-        </w:tc>
-        <w:tc>
-          <w:tcPr>
-            <w:tcW w:type="dxa" w:w="2880"/>
-          </w:tcPr>
-          <w:p>
-            <w:r>
-              <w:rPr>
-                <w:sz w:val="20"/>
-              </w:rPr>
-              <w:t>Reader</w:t>
-            </w:r>
-          </w:p>
-        </w:tc>
-      </w:tr>
-      <w:tr>
-        <w:tc>
-          <w:tcPr>
-            <w:tcW w:type="dxa" w:w="2880"/>
-          </w:tcPr>
-          <w:p>
-            <w:r>
-              <w:rPr>
-                <w:sz w:val="20"/>
-              </w:rPr>
-              <w:t>6</w:t>
-            </w:r>
-          </w:p>
-        </w:tc>
-        <w:tc>
-          <w:tcPr>
-            <w:tcW w:type="dxa" w:w="2880"/>
-          </w:tcPr>
-          <w:p>
-            <w:r>
-              <w:rPr>
-                <w:sz w:val="20"/>
-              </w:rPr>
-              <w:t>iPhone clears old data on the reader (safety)</w:t>
-            </w:r>
-          </w:p>
-        </w:tc>
-        <w:tc>
-          <w:tcPr>
-            <w:tcW w:type="dxa" w:w="2880"/>
-          </w:tcPr>
-          <w:p>
-            <w:r>
-              <w:rPr>
-                <w:sz w:val="20"/>
-              </w:rPr>
-              <w:t>iPhone</w:t>
-            </w:r>
-          </w:p>
-        </w:tc>
-      </w:tr>
-      <w:tr>
-        <w:tc>
-          <w:tcPr>
-            <w:tcW w:type="dxa" w:w="2880"/>
-          </w:tcPr>
-          <w:p>
-            <w:r>
-              <w:rPr>
-                <w:sz w:val="20"/>
-              </w:rPr>
-              <w:t>7</w:t>
-            </w:r>
-          </w:p>
-        </w:tc>
-        <w:tc>
-          <w:tcPr>
-            <w:tcW w:type="dxa" w:w="2880"/>
-          </w:tcPr>
-          <w:p>
-            <w:r>
-              <w:rPr>
-                <w:sz w:val="20"/>
-              </w:rPr>
-              <w:t>iPhone writes the guest data (JSON in NDEF format)</w:t>
-            </w:r>
-          </w:p>
-        </w:tc>
-        <w:tc>
-          <w:tcPr>
-            <w:tcW w:type="dxa" w:w="2880"/>
-          </w:tcPr>
-          <w:p>
-            <w:r>
-              <w:rPr>
-                <w:sz w:val="20"/>
-              </w:rPr>
-              <w:t>iPhone</w:t>
-            </w:r>
-          </w:p>
-        </w:tc>
-      </w:tr>
-      <w:tr>
-        <w:tc>
-          <w:tcPr>
-            <w:tcW w:type="dxa" w:w="2880"/>
-          </w:tcPr>
-          <w:p>
-            <w:r>
-              <w:rPr>
-                <w:sz w:val="20"/>
-              </w:rPr>
-              <w:t>8</w:t>
-            </w:r>
-          </w:p>
-        </w:tc>
-        <w:tc>
-          <w:tcPr>
-            <w:tcW w:type="dxa" w:w="2880"/>
-          </w:tcPr>
-          <w:p>
-            <w:r>
-              <w:rPr>
-                <w:sz w:val="20"/>
-              </w:rPr>
-              <w:t>iPhone confirms the write (sets final length)</w:t>
-            </w:r>
-          </w:p>
-        </w:tc>
-        <w:tc>
-          <w:tcPr>
-            <w:tcW w:type="dxa" w:w="2880"/>
-          </w:tcPr>
-          <w:p>
-            <w:r>
-              <w:rPr>
-                <w:sz w:val="20"/>
-              </w:rPr>
-              <w:t>iPhone</w:t>
-            </w:r>
-          </w:p>
-        </w:tc>
-      </w:tr>
-      <w:tr>
-        <w:tc>
-          <w:tcPr>
-            <w:tcW w:type="dxa" w:w="2880"/>
-          </w:tcPr>
-          <w:p>
-            <w:r>
-              <w:rPr>
-                <w:sz w:val="20"/>
-              </w:rPr>
-              <w:t>9</w:t>
-            </w:r>
-          </w:p>
-        </w:tc>
-        <w:tc>
-          <w:tcPr>
-            <w:tcW w:type="dxa" w:w="2880"/>
-          </w:tcPr>
-          <w:p>
-            <w:r>
-              <w:rPr>
-                <w:sz w:val="20"/>
-              </w:rPr>
-              <w:t>iPhone shows "Access Granted" and disconnects</w:t>
-            </w:r>
-          </w:p>
-        </w:tc>
-        <w:tc>
-          <w:tcPr>
-            <w:tcW w:type="dxa" w:w="2880"/>
-          </w:tcPr>
-          <w:p>
-            <w:r>
-              <w:rPr>
-                <w:sz w:val="20"/>
-              </w:rPr>
-              <w:t>iPhone</w:t>
-            </w:r>
-          </w:p>
-        </w:tc>
-      </w:tr>
-      <w:tr>
-        <w:tc>
-          <w:tcPr>
-            <w:tcW w:type="dxa" w:w="2880"/>
-          </w:tcPr>
-          <w:p>
-            <w:r>
-              <w:rPr>
-                <w:sz w:val="20"/>
-              </w:rPr>
-              <w:t>10</w:t>
-            </w:r>
-          </w:p>
-        </w:tc>
-        <w:tc>
-          <w:tcPr>
-            <w:tcW w:type="dxa" w:w="2880"/>
-          </w:tcPr>
-          <w:p>
-            <w:r>
-              <w:rPr>
-                <w:sz w:val="20"/>
-              </w:rPr>
-              <w:t>Reader detects new data, parses JSON, unlocks door</w:t>
-            </w:r>
-          </w:p>
-        </w:tc>
-        <w:tc>
-          <w:tcPr>
-            <w:tcW w:type="dxa" w:w="2880"/>
-          </w:tcPr>
-          <w:p>
-            <w:r>
-              <w:rPr>
-                <w:sz w:val="20"/>
-              </w:rPr>
-              <w:t>Reader</w:t>
-            </w:r>
-          </w:p>
-        </w:tc>
-      </w:tr>
-    </w:tbl>
-    <w:p>
-      <w:pPr>
-        <w:pStyle w:val="Heading1"/>
-      </w:pPr>
-      <w:r>
-        <w:rPr>
-          <w:color w:val="1A73E8"/>
-        </w:rPr>
-        <w:t>3. What the Reader Must Have</w:t>
-      </w:r>
-    </w:p>
-    <w:p>
-      <w:pPr>
-        <w:pStyle w:val="Heading2"/>
-      </w:pPr>
-      <w:r>
-        <w:rPr>
-          <w:color w:val="1A73E8"/>
-        </w:rPr>
-        <w:t>3.1 Tag Mode Configuration</w:t>
-      </w:r>
-    </w:p>
-    <w:p>
-      <w:r>
-        <w:t>For iPhone support, the PN532 must be configured in Tag Mode (Target Mode). The key settings are:</w:t>
-      </w:r>
-    </w:p>
-    <w:tbl>
-      <w:tblPr>
-        <w:tblStyle w:val="LightGrid-Accent1"/>
-        <w:tblW w:type="auto" w:w="0"/>
-        <w:jc w:val="center"/>
-        <w:tblLook w:firstColumn="1" w:firstRow="1" w:lastColumn="0" w:lastRow="0" w:noHBand="0" w:noVBand="1" w:val="04A0"/>
-      </w:tblPr>
-      <w:tblGrid>
-        <w:gridCol w:w="2880"/>
-        <w:gridCol w:w="2880"/>
-        <w:gridCol w:w="2880"/>
-      </w:tblGrid>
-      <w:tr>
-        <w:tc>
-          <w:tcPr>
-            <w:tcW w:type="dxa" w:w="2880"/>
-          </w:tcPr>
-          <w:p>
-            <w:r>
-              <w:rPr>
-                <w:b/>
-                <w:sz w:val="20"/>
-              </w:rPr>
-              <w:t>Setting</w:t>
-            </w:r>
-          </w:p>
-        </w:tc>
-        <w:tc>
-          <w:tcPr>
-            <w:tcW w:type="dxa" w:w="2880"/>
-          </w:tcPr>
-          <w:p>
-            <w:r>
-              <w:rPr>
-                <w:b/>
-                <w:sz w:val="20"/>
-              </w:rPr>
-              <w:t>Required Value</w:t>
-            </w:r>
-          </w:p>
-        </w:tc>
-        <w:tc>
-          <w:tcPr>
-            <w:tcW w:type="dxa" w:w="2880"/>
-          </w:tcPr>
-          <w:p>
-            <w:r>
-              <w:rPr>
-                <w:b/>
-                <w:sz w:val="20"/>
-              </w:rPr>
-              <w:t>Why</w:t>
-            </w:r>
-          </w:p>
-        </w:tc>
-      </w:tr>
-      <w:tr>
-        <w:tc>
-          <w:tcPr>
-            <w:tcW w:type="dxa" w:w="2880"/>
-          </w:tcPr>
-          <w:p>
-            <w:r>
-              <w:rPr>
-                <w:sz w:val="20"/>
-              </w:rPr>
-              <w:t>Mode</w:t>
-            </w:r>
-          </w:p>
-        </w:tc>
-        <w:tc>
-          <w:tcPr>
-            <w:tcW w:type="dxa" w:w="2880"/>
-          </w:tcPr>
-          <w:p>
-            <w:r>
-              <w:rPr>
-                <w:sz w:val="20"/>
-              </w:rPr>
-              <w:t>Target Mode (TgInitAsTarget)</w:t>
-            </w:r>
-          </w:p>
-        </w:tc>
-        <w:tc>
-          <w:tcPr>
-            <w:tcW w:type="dxa" w:w="2880"/>
-          </w:tcPr>
-          <w:p>
-            <w:r>
-              <w:rPr>
-                <w:sz w:val="20"/>
-              </w:rPr>
-              <w:t>Makes the reader appear as a tag to iPhone</w:t>
-            </w:r>
-          </w:p>
-        </w:tc>
-      </w:tr>
-      <w:tr>
-        <w:tc>
-          <w:tcPr>
-            <w:tcW w:type="dxa" w:w="2880"/>
-          </w:tcPr>
-          <w:p>
-            <w:r>
-              <w:rPr>
-                <w:sz w:val="20"/>
-              </w:rPr>
-              <w:t>SAK byte</w:t>
-            </w:r>
-          </w:p>
-        </w:tc>
-        <w:tc>
-          <w:tcPr>
-            <w:tcW w:type="dxa" w:w="2880"/>
-          </w:tcPr>
-          <w:p>
-            <w:r>
-              <w:rPr>
-                <w:sz w:val="20"/>
-              </w:rPr>
-              <w:t>0x20 (bit 6 must be set)</w:t>
-            </w:r>
-          </w:p>
-        </w:tc>
-        <w:tc>
-          <w:tcPr>
-            <w:tcW w:type="dxa" w:w="2880"/>
-          </w:tcPr>
-          <w:p>
-            <w:r>
-              <w:rPr>
-                <w:sz w:val="20"/>
-              </w:rPr>
-              <w:t>Tells iPhone this is an ISO 14443-4 tag. Without this, iPhone will NOT detect the reader.</w:t>
-            </w:r>
-          </w:p>
-        </w:tc>
-      </w:tr>
-      <w:tr>
-        <w:tc>
-          <w:tcPr>
-            <w:tcW w:type="dxa" w:w="2880"/>
-          </w:tcPr>
-          <w:p>
-            <w:r>
-              <w:rPr>
-                <w:sz w:val="20"/>
-              </w:rPr>
-              <w:t>Communication speed</w:t>
-            </w:r>
-          </w:p>
-        </w:tc>
-        <w:tc>
-          <w:tcPr>
-            <w:tcW w:type="dxa" w:w="2880"/>
-          </w:tcPr>
-          <w:p>
-            <w:r>
-              <w:rPr>
-                <w:sz w:val="20"/>
-              </w:rPr>
-              <w:t>106 kbps passive</w:t>
-            </w:r>
-          </w:p>
-        </w:tc>
-        <w:tc>
-          <w:tcPr>
-            <w:tcW w:type="dxa" w:w="2880"/>
-          </w:tcPr>
-          <w:p>
-            <w:r>
-              <w:rPr>
-                <w:sz w:val="20"/>
-              </w:rPr>
-              <w:t>Standard NFC speed, ISO 14443-A</w:t>
-            </w:r>
-          </w:p>
-        </w:tc>
-      </w:tr>
-      <w:tr>
-        <w:tc>
-          <w:tcPr>
-            <w:tcW w:type="dxa" w:w="2880"/>
-          </w:tcPr>
-          <w:p>
-            <w:r>
-              <w:rPr>
-                <w:sz w:val="20"/>
-              </w:rPr>
-              <w:t>Data buffer</w:t>
-            </w:r>
-          </w:p>
-        </w:tc>
-        <w:tc>
-          <w:tcPr>
-            <w:tcW w:type="dxa" w:w="2880"/>
-          </w:tcPr>
-          <w:p>
-            <w:r>
-              <w:rPr>
-                <w:sz w:val="20"/>
-              </w:rPr>
-              <w:t>At least 1024 bytes</w:t>
-            </w:r>
-          </w:p>
-        </w:tc>
-        <w:tc>
-          <w:tcPr>
-            <w:tcW w:type="dxa" w:w="2880"/>
-          </w:tcPr>
-          <w:p>
-            <w:r>
-              <w:rPr>
-                <w:sz w:val="20"/>
-              </w:rPr>
-              <w:t>To hold the guest data message</w:t>
-            </w:r>
-          </w:p>
-        </w:tc>
-      </w:tr>
-    </w:tbl>
-    <w:p/>
-    <w:p>
-      <w:r>
-        <w:rPr>
-          <w:i/>
-          <w:color w:val="86868B"/>
-          <w:sz w:val="20"/>
-        </w:rPr>
-        <w:t>CRITICAL: If the SAK byte does not have bit 6 set (value 0x20 or 0x60), the iPhone will completely ignore the reader. This is the #1 issue teams run into.</w:t>
-      </w:r>
-    </w:p>
-    <w:p>
-      <w:pPr>
-        <w:pStyle w:val="Heading2"/>
-      </w:pPr>
-      <w:r>
-        <w:rPr>
-          <w:color w:val="1A73E8"/>
-        </w:rPr>
-        <w:t>3.2 Commands the Reader Must Respond To</w:t>
-      </w:r>
-    </w:p>
-    <w:p>
-      <w:r>
-        <w:t>When in Tag Mode, the iPhone will send 3 types of commands. The reader must handle all of them:</w:t>
-      </w:r>
-    </w:p>
-    <w:tbl>
-      <w:tblPr>
-        <w:tblStyle w:val="LightGrid-Accent1"/>
-        <w:tblW w:type="auto" w:w="0"/>
-        <w:jc w:val="center"/>
-        <w:tblLook w:firstColumn="1" w:firstRow="1" w:lastColumn="0" w:lastRow="0" w:noHBand="0" w:noVBand="1" w:val="04A0"/>
-      </w:tblPr>
-      <w:tblGrid>
-        <w:gridCol w:w="2880"/>
-        <w:gridCol w:w="2880"/>
-        <w:gridCol w:w="2880"/>
-      </w:tblGrid>
-      <w:tr>
-        <w:tc>
-          <w:tcPr>
-            <w:tcW w:type="dxa" w:w="2880"/>
-          </w:tcPr>
-          <w:p>
-            <w:r>
-              <w:rPr>
-                <w:b/>
-                <w:sz w:val="20"/>
-              </w:rPr>
-              <w:t>Command</w:t>
-            </w:r>
-          </w:p>
-        </w:tc>
-        <w:tc>
-          <w:tcPr>
-            <w:tcW w:type="dxa" w:w="2880"/>
-          </w:tcPr>
-          <w:p>
-            <w:r>
-              <w:rPr>
-                <w:b/>
-                <w:sz w:val="20"/>
-              </w:rPr>
-              <w:t>What iPhone is Asking</w:t>
-            </w:r>
-          </w:p>
-        </w:tc>
-        <w:tc>
-          <w:tcPr>
-            <w:tcW w:type="dxa" w:w="2880"/>
-          </w:tcPr>
-          <w:p>
-            <w:r>
-              <w:rPr>
-                <w:b/>
-                <w:sz w:val="20"/>
-              </w:rPr>
-              <w:t>What Reader Must Do</w:t>
-            </w:r>
-          </w:p>
-        </w:tc>
-      </w:tr>
-      <w:tr>
-        <w:tc>
-          <w:tcPr>
-            <w:tcW w:type="dxa" w:w="2880"/>
-          </w:tcPr>
-          <w:p>
-            <w:r>
-              <w:rPr>
-                <w:sz w:val="20"/>
-              </w:rPr>
-              <w:t>SELECT</w:t>
-            </w:r>
-          </w:p>
-        </w:tc>
-        <w:tc>
-          <w:tcPr>
-            <w:tcW w:type="dxa" w:w="2880"/>
-          </w:tcPr>
-          <w:p>
-            <w:r>
-              <w:rPr>
-                <w:sz w:val="20"/>
-              </w:rPr>
-              <w:t>"I want to talk to the NDEF application" or "I want to access a specific file"</w:t>
-            </w:r>
-          </w:p>
-        </w:tc>
-        <w:tc>
-          <w:tcPr>
-            <w:tcW w:type="dxa" w:w="2880"/>
-          </w:tcPr>
-          <w:p>
-            <w:r>
-              <w:rPr>
-                <w:sz w:val="20"/>
-              </w:rPr>
-              <w:t>Remember which file is selected and respond OK</w:t>
-            </w:r>
-          </w:p>
-        </w:tc>
-      </w:tr>
-      <w:tr>
-        <w:tc>
-          <w:tcPr>
-            <w:tcW w:type="dxa" w:w="2880"/>
-          </w:tcPr>
-          <w:p>
-            <w:r>
-              <w:rPr>
-                <w:sz w:val="20"/>
-              </w:rPr>
-              <w:t>READ</w:t>
-            </w:r>
-          </w:p>
-        </w:tc>
-        <w:tc>
-          <w:tcPr>
-            <w:tcW w:type="dxa" w:w="2880"/>
-          </w:tcPr>
-          <w:p>
-            <w:r>
-              <w:rPr>
-                <w:sz w:val="20"/>
-              </w:rPr>
-              <w:t>"Give me the contents of the selected file"</w:t>
-            </w:r>
-          </w:p>
-        </w:tc>
-        <w:tc>
-          <w:tcPr>
-            <w:tcW w:type="dxa" w:w="2880"/>
-          </w:tcPr>
-          <w:p>
-            <w:r>
-              <w:rPr>
-                <w:sz w:val="20"/>
-              </w:rPr>
-              <w:t>Return the requested bytes from the selected file</w:t>
-            </w:r>
-          </w:p>
-        </w:tc>
-      </w:tr>
-      <w:tr>
-        <w:tc>
-          <w:tcPr>
-            <w:tcW w:type="dxa" w:w="2880"/>
-          </w:tcPr>
-          <w:p>
-            <w:r>
-              <w:rPr>
-                <w:sz w:val="20"/>
-              </w:rPr>
-              <w:t>UPDATE (WRITE)</w:t>
-            </w:r>
-          </w:p>
-        </w:tc>
-        <w:tc>
-          <w:tcPr>
-            <w:tcW w:type="dxa" w:w="2880"/>
-          </w:tcPr>
-          <w:p>
-            <w:r>
-              <w:rPr>
-                <w:sz w:val="20"/>
-              </w:rPr>
-              <w:t>"Here is data to store in the selected file"</w:t>
-            </w:r>
-          </w:p>
-        </w:tc>
-        <w:tc>
-          <w:tcPr>
-            <w:tcW w:type="dxa" w:w="2880"/>
-          </w:tcPr>
-          <w:p>
-            <w:r>
-              <w:rPr>
-                <w:sz w:val="20"/>
-              </w:rPr>
-              <w:t>Store the bytes in your buffer and respond OK</w:t>
-            </w:r>
-          </w:p>
-        </w:tc>
-      </w:tr>
-    </w:tbl>
-    <w:p>
-      <w:pPr>
-        <w:pStyle w:val="Heading2"/>
-      </w:pPr>
-      <w:r>
-        <w:rPr>
-          <w:color w:val="1A73E8"/>
-        </w:rPr>
-        <w:t>3.3 Two Files the Reader Must Serve</w:t>
-      </w:r>
-    </w:p>
-    <w:p>
-      <w:r>
-        <w:t>The reader must serve two virtual files to the iPhone:</w:t>
+        <w:t>The PN532 runs a continuous loop that alternates between two modes:</w:t>
       </w:r>
     </w:p>
     <w:tbl>
@@ -1203,9 +107,7 @@
             <w:r>
               <w:rPr>
                 <w:b/>
-                <w:sz w:val="20"/>
               </w:rPr>
-              <w:t>File</w:t>
             </w:r>
           </w:p>
         </w:tc>
@@ -1217,9 +119,8 @@
             <w:r>
               <w:rPr>
                 <w:b/>
-                <w:sz w:val="20"/>
               </w:rPr>
-              <w:t>ID</w:t>
+              <w:t>Target Mode (for iPhone)</w:t>
             </w:r>
           </w:p>
         </w:tc>
@@ -1231,9 +132,8 @@
             <w:r>
               <w:rPr>
                 <w:b/>
-                <w:sz w:val="20"/>
               </w:rPr>
-              <w:t>What It Contains</w:t>
+              <w:t>Reader Mode (for Cards)</w:t>
             </w:r>
           </w:p>
         </w:tc>
@@ -1245,9 +145,8 @@
             <w:r>
               <w:rPr>
                 <w:b/>
-                <w:sz w:val="20"/>
               </w:rPr>
-              <w:t>Purpose</w:t>
+              <w:t>Notes</w:t>
             </w:r>
           </w:p>
         </w:tc>
@@ -1259,10 +158,7 @@
           </w:tcPr>
           <w:p>
             <w:r>
-              <w:rPr>
-                <w:sz w:val="20"/>
-              </w:rPr>
-              <w:t>Capability Container (CC)</w:t>
+              <w:t>Duration</w:t>
             </w:r>
           </w:p>
         </w:tc>
@@ -1272,10 +168,7 @@
           </w:tcPr>
           <w:p>
             <w:r>
-              <w:rPr>
-                <w:sz w:val="20"/>
-              </w:rPr>
-              <w:t>E103</w:t>
+              <w:t>500ms</w:t>
             </w:r>
           </w:p>
         </w:tc>
@@ -1285,10 +178,7 @@
           </w:tcPr>
           <w:p>
             <w:r>
-              <w:rPr>
-                <w:sz w:val="20"/>
-              </w:rPr>
-              <w:t>Tag capabilities: max size, read/write permissions</w:t>
+              <w:t>20ms</w:t>
             </w:r>
           </w:p>
         </w:tc>
@@ -1298,10 +188,7 @@
           </w:tcPr>
           <w:p>
             <w:r>
-              <w:rPr>
-                <w:sz w:val="20"/>
-              </w:rPr>
-              <w:t>iPhone reads this first to know what the tag can do</w:t>
+              <w:t>Target mode is 96% of the time</w:t>
             </w:r>
           </w:p>
         </w:tc>
@@ -1313,10 +200,7 @@
           </w:tcPr>
           <w:p>
             <w:r>
-              <w:rPr>
-                <w:sz w:val="20"/>
-              </w:rPr>
-              <w:t>NDEF Data File</w:t>
+              <w:t>RF Field</w:t>
             </w:r>
           </w:p>
         </w:tc>
@@ -1326,10 +210,7 @@
           </w:tcPr>
           <w:p>
             <w:r>
-              <w:rPr>
-                <w:sz w:val="20"/>
-              </w:rPr>
-              <w:t>E104</w:t>
+              <w:t>OFF — PN532 is silent</w:t>
             </w:r>
           </w:p>
         </w:tc>
@@ -1339,10 +220,7 @@
           </w:tcPr>
           <w:p>
             <w:r>
-              <w:rPr>
-                <w:sz w:val="20"/>
-              </w:rPr>
-              <w:t>The actual guest data (written by iPhone)</w:t>
+              <w:t>ON — PN532 generates RF</w:t>
             </w:r>
           </w:p>
         </w:tc>
@@ -1352,11 +230,48 @@
           </w:tcPr>
           <w:p>
             <w:r>
-              <w:rPr>
-                <w:sz w:val="20"/>
-              </w:rPr>
-              <w:t>iPhone writes the guest JSON here</w:t>
+              <w:t>iPhone only safe when RF is OFF</w:t>
             </w:r>
+          </w:p>
+        </w:tc>
+      </w:tr>
+      <w:tr>
+        <w:tc>
+          <w:tcPr>
+            <w:tcW w:type="dxa" w:w="2160"/>
+          </w:tcPr>
+          <w:p>
+            <w:r>
+              <w:t>PN532 Command</w:t>
+            </w:r>
+          </w:p>
+        </w:tc>
+        <w:tc>
+          <w:tcPr>
+            <w:tcW w:type="dxa" w:w="2160"/>
+          </w:tcPr>
+          <w:p>
+            <w:r>
+              <w:t>TgInitAsTarget (0x8C)</w:t>
+            </w:r>
+          </w:p>
+        </w:tc>
+        <w:tc>
+          <w:tcPr>
+            <w:tcW w:type="dxa" w:w="2160"/>
+          </w:tcPr>
+          <w:p>
+            <w:r>
+              <w:t>InListPassiveTarget (0x4A)</w:t>
+            </w:r>
+          </w:p>
+        </w:tc>
+        <w:tc>
+          <w:tcPr>
+            <w:tcW w:type="dxa" w:w="2160"/>
+          </w:tcPr>
+          <w:p>
+            <w:r/>
           </w:p>
         </w:tc>
       </w:tr>
@@ -1364,83 +279,24 @@
     <w:p/>
     <w:p>
       <w:r>
-        <w:t>The Capability Container must tell the iPhone:</w:t>
-      </w:r>
-    </w:p>
-    <w:p>
-      <w:pPr>
-        <w:pStyle w:val="ListBullet"/>
-      </w:pPr>
-      <w:r>
-        <w:t>NFC Forum Type 4 Tag version 2.0</w:t>
-      </w:r>
-    </w:p>
-    <w:p>
-      <w:pPr>
-        <w:pStyle w:val="ListBullet"/>
-      </w:pPr>
-      <w:r>
-        <w:t>Maximum read size: 255 bytes per command</w:t>
-      </w:r>
-    </w:p>
-    <w:p>
-      <w:pPr>
-        <w:pStyle w:val="ListBullet"/>
-      </w:pPr>
-      <w:r>
-        <w:t>Maximum write size: 255 bytes per command</w:t>
-      </w:r>
-    </w:p>
-    <w:p>
-      <w:pPr>
-        <w:pStyle w:val="ListBullet"/>
-      </w:pPr>
-      <w:r>
-        <w:t>NDEF file location: E104</w:t>
-      </w:r>
-    </w:p>
-    <w:p>
-      <w:pPr>
-        <w:pStyle w:val="ListBullet"/>
-      </w:pPr>
-      <w:r>
-        <w:t>Maximum NDEF data size: 1024 bytes</w:t>
-      </w:r>
-    </w:p>
-    <w:p>
-      <w:pPr>
-        <w:pStyle w:val="ListBullet"/>
-      </w:pPr>
-      <w:r>
-        <w:t>Read access: Open (no authentication)</w:t>
-      </w:r>
-    </w:p>
-    <w:p>
-      <w:pPr>
-        <w:pStyle w:val="ListBullet"/>
-      </w:pPr>
-      <w:r>
-        <w:t>Write access: Open (no authentication)</w:t>
-      </w:r>
-    </w:p>
-    <w:p/>
-    <w:p>
-      <w:r>
-        <w:t>The CC file is always the same 15 bytes:</w:t>
-      </w:r>
-    </w:p>
-    <w:p>
-      <w:r>
-        <w:rPr>
-          <w:rFonts w:ascii="Courier New" w:hAnsi="Courier New"/>
-          <w:sz w:val="18"/>
-        </w:rPr>
-        <w:t>00 0F 20 00 FF 00 FF 04 06 E1 04 04 00 00 00</w:t>
-      </w:r>
-    </w:p>
-    <w:p>
-      <w:r>
-        <w:br w:type="page"/>
+        <w:t>Loop order — Target mode runs FIRST:</w:t>
+        <w:br/>
+        <w:br/>
+        <w:t xml:space="preserve">  1. Enter Target Mode (500ms timeout)</w:t>
+        <w:br/>
+        <w:t xml:space="preserve">     → If iPhone detected → stay in Target Mode → receive full NDEF data → loop back</w:t>
+        <w:br/>
+        <w:t xml:space="preserve">     → If timeout (no iPhone) → go to step 2</w:t>
+        <w:br/>
+        <w:br/>
+        <w:t xml:space="preserve">  2. Enter Reader Mode (20ms timeout)</w:t>
+        <w:br/>
+        <w:t xml:space="preserve">     → If NFC card detected → stay in Reader Mode → read card → loop back</w:t>
+        <w:br/>
+        <w:t xml:space="preserve">     → If timeout (no card) → go to step 1</w:t>
+        <w:br/>
+        <w:br/>
+        <w:t>Target mode is checked FIRST because it is safe (no RF). Reader mode is checked SECOND and kept very short (20ms). A physical NFC card responds in under 5ms, so 20ms is more than enough.</w:t>
       </w:r>
     </w:p>
     <w:p>
@@ -1448,15 +304,7 @@
         <w:pStyle w:val="Heading1"/>
       </w:pPr>
       <w:r>
-        <w:rPr>
-          <w:color w:val="1A73E8"/>
-        </w:rPr>
-        <w:t>4. How to Know When Data Has Arrived</w:t>
-      </w:r>
-    </w:p>
-    <w:p>
-      <w:r>
-        <w:t>The iPhone writes data to the NDEF file in 3 steps:</w:t>
+        <w:t>4. Why Target Mode Must Be First and Longer</w:t>
       </w:r>
     </w:p>
     <w:tbl>
@@ -1480,9 +328,8 @@
             <w:r>
               <w:rPr>
                 <w:b/>
-                <w:sz w:val="20"/>
               </w:rPr>
-              <w:t>Step</w:t>
+              <w:t>Scenario</w:t>
             </w:r>
           </w:p>
         </w:tc>
@@ -1494,9 +341,8 @@
             <w:r>
               <w:rPr>
                 <w:b/>
-                <w:sz w:val="20"/>
               </w:rPr>
-              <w:t>What iPhone Writes</w:t>
+              <w:t>What Happens</w:t>
             </w:r>
           </w:p>
         </w:tc>
@@ -1508,9 +354,8 @@
             <w:r>
               <w:rPr>
                 <w:b/>
-                <w:sz w:val="20"/>
               </w:rPr>
-              <w:t>What It Means</w:t>
+              <w:t>Result</w:t>
             </w:r>
           </w:p>
         </w:tc>
@@ -1522,10 +367,7 @@
           </w:tcPr>
           <w:p>
             <w:r>
-              <w:rPr>
-                <w:sz w:val="20"/>
-              </w:rPr>
-              <w:t>1. Clear</w:t>
+              <w:t>iPhone taps during Target Mode (96% of time)</w:t>
             </w:r>
           </w:p>
         </w:tc>
@@ -1535,10 +377,7 @@
           </w:tcPr>
           <w:p>
             <w:r>
-              <w:rPr>
-                <w:sz w:val="20"/>
-              </w:rPr>
-              <w:t>Writes 00 00 at position 0</w:t>
+              <w:t>PN532 is silent (no RF). iPhone generates RF. PN532 responds as tag.</w:t>
             </w:r>
           </w:p>
         </w:tc>
@@ -1548,10 +387,7 @@
           </w:tcPr>
           <w:p>
             <w:r>
-              <w:rPr>
-                <w:sz w:val="20"/>
-              </w:rPr>
-              <w:t>Erases the old length — "I am about to write new data"</w:t>
+              <w:t>✅ App receives data</w:t>
             </w:r>
           </w:p>
         </w:tc>
@@ -1563,10 +399,7 @@
           </w:tcPr>
           <w:p>
             <w:r>
-              <w:rPr>
-                <w:sz w:val="20"/>
-              </w:rPr>
-              <w:t>2. Data</w:t>
+              <w:t>iPhone taps during Reader Mode (4% of time)</w:t>
             </w:r>
           </w:p>
         </w:tc>
@@ -1576,10 +409,7 @@
           </w:tcPr>
           <w:p>
             <w:r>
-              <w:rPr>
-                <w:sz w:val="20"/>
-              </w:rPr>
-              <w:t>Writes NDEF bytes at position 2+</w:t>
+              <w:t>PN532 is generating RF. iPhone detects external RF field.</w:t>
             </w:r>
           </w:p>
         </w:tc>
@@ -1589,51 +419,7 @@
           </w:tcPr>
           <w:p>
             <w:r>
-              <w:rPr>
-                <w:sz w:val="20"/>
-              </w:rPr>
-              <w:t>The actual guest data message</w:t>
-            </w:r>
-          </w:p>
-        </w:tc>
-      </w:tr>
-      <w:tr>
-        <w:tc>
-          <w:tcPr>
-            <w:tcW w:type="dxa" w:w="2880"/>
-          </w:tcPr>
-          <w:p>
-            <w:r>
-              <w:rPr>
-                <w:sz w:val="20"/>
-              </w:rPr>
-              <w:t>3. Confirm</w:t>
-            </w:r>
-          </w:p>
-        </w:tc>
-        <w:tc>
-          <w:tcPr>
-            <w:tcW w:type="dxa" w:w="2880"/>
-          </w:tcPr>
-          <w:p>
-            <w:r>
-              <w:rPr>
-                <w:sz w:val="20"/>
-              </w:rPr>
-              <w:t>Writes real length at position 0</w:t>
-            </w:r>
-          </w:p>
-        </w:tc>
-        <w:tc>
-          <w:tcPr>
-            <w:tcW w:type="dxa" w:w="2880"/>
-          </w:tcPr>
-          <w:p>
-            <w:r>
-              <w:rPr>
-                <w:sz w:val="20"/>
-              </w:rPr>
-              <w:t>The length is now &gt; 0 — "Writing is complete"</w:t>
+              <w:t>❌ Wallet opens (user retries)</w:t>
             </w:r>
           </w:p>
         </w:tc>
@@ -1642,21 +428,7 @@
     <w:p/>
     <w:p>
       <w:r>
-        <w:t>Your trigger to process the data:</w:t>
-      </w:r>
-    </w:p>
-    <w:p>
-      <w:r>
-        <w:rPr>
-          <w:b/>
-        </w:rPr>
-        <w:t>When a WRITE command arrives at position 0 AND the length value is greater than 0 → the guest data is complete and ready to be read.</w:t>
-      </w:r>
-    </w:p>
-    <w:p/>
-    <w:p>
-      <w:r>
-        <w:t>Do NOT process data during step 1 (length is 0) or step 2 (length is still 0 from step 1). Only process when step 3 sets the length to a real value.</w:t>
+        <w:t>With 96/4 split, the chance of Wallet opening is very small. If it does happen, the user simply closes Wallet and taps again — next attempt will almost certainly hit the Target Mode window.</w:t>
       </w:r>
     </w:p>
     <w:p>
@@ -1664,10 +436,12 @@
         <w:pStyle w:val="Heading1"/>
       </w:pPr>
       <w:r>
-        <w:rPr>
-          <w:color w:val="1A73E8"/>
-        </w:rPr>
-        <w:t>5. The Data You Will Receive</w:t>
+        <w:t>5. PN532 Target Mode Configuration</w:t>
+      </w:r>
+    </w:p>
+    <w:p>
+      <w:r>
+        <w:t>When entering Target Mode, the PN532 must present itself as an ISO 14443-4 tag that the iPhone recognizes as an NDEF Type 4 Tag.</w:t>
       </w:r>
     </w:p>
     <w:p>
@@ -1675,405 +449,7 @@
         <w:pStyle w:val="Heading2"/>
       </w:pPr>
       <w:r>
-        <w:rPr>
-          <w:color w:val="1A73E8"/>
-        </w:rPr>
-        <w:t>5.1 The JSON Message</w:t>
-      </w:r>
-    </w:p>
-    <w:p>
-      <w:r>
-        <w:t>After extracting the text from the NDEF message, you get this JSON:</w:t>
-      </w:r>
-    </w:p>
-    <w:p>
-      <w:r>
-        <w:rPr>
-          <w:rFonts w:ascii="Courier New" w:hAnsi="Courier New"/>
-          <w:sz w:val="18"/>
-        </w:rPr>
-        <w:t>{</w:t>
-        <w:br/>
-        <w:t xml:space="preserve">    "masterKey": "A1B2C3D4E5F6G7H8",</w:t>
-        <w:br/>
-        <w:t xml:space="preserve">    "roomNumber": "101",</w:t>
-        <w:br/>
-        <w:t xml:space="preserve">    "checkIn": "2026-02-27 14:00",</w:t>
-        <w:br/>
-        <w:t xml:space="preserve">    "checkOut": "2026-02-28 12:00",</w:t>
-        <w:br/>
-        <w:t xml:space="preserve">    "timestamp": 1740667200000</w:t>
-        <w:br/>
-        <w:t>}</w:t>
-      </w:r>
-    </w:p>
-    <w:p>
-      <w:pPr>
-        <w:pStyle w:val="Heading2"/>
-      </w:pPr>
-      <w:r>
-        <w:rPr>
-          <w:color w:val="1A73E8"/>
-        </w:rPr>
-        <w:t>5.2 Field Descriptions</w:t>
-      </w:r>
-    </w:p>
-    <w:tbl>
-      <w:tblPr>
-        <w:tblStyle w:val="LightGrid-Accent1"/>
-        <w:tblW w:type="auto" w:w="0"/>
-        <w:jc w:val="center"/>
-        <w:tblLook w:firstColumn="1" w:firstRow="1" w:lastColumn="0" w:lastRow="0" w:noHBand="0" w:noVBand="1" w:val="04A0"/>
-      </w:tblPr>
-      <w:tblGrid>
-        <w:gridCol w:w="2160"/>
-        <w:gridCol w:w="2160"/>
-        <w:gridCol w:w="2160"/>
-        <w:gridCol w:w="2160"/>
-      </w:tblGrid>
-      <w:tr>
-        <w:tc>
-          <w:tcPr>
-            <w:tcW w:type="dxa" w:w="2160"/>
-          </w:tcPr>
-          <w:p>
-            <w:r>
-              <w:rPr>
-                <w:b/>
-                <w:sz w:val="20"/>
-              </w:rPr>
-              <w:t>Field</w:t>
-            </w:r>
-          </w:p>
-        </w:tc>
-        <w:tc>
-          <w:tcPr>
-            <w:tcW w:type="dxa" w:w="2160"/>
-          </w:tcPr>
-          <w:p>
-            <w:r>
-              <w:rPr>
-                <w:b/>
-                <w:sz w:val="20"/>
-              </w:rPr>
-              <w:t>Type</w:t>
-            </w:r>
-          </w:p>
-        </w:tc>
-        <w:tc>
-          <w:tcPr>
-            <w:tcW w:type="dxa" w:w="2160"/>
-          </w:tcPr>
-          <w:p>
-            <w:r>
-              <w:rPr>
-                <w:b/>
-                <w:sz w:val="20"/>
-              </w:rPr>
-              <w:t>Format</w:t>
-            </w:r>
-          </w:p>
-        </w:tc>
-        <w:tc>
-          <w:tcPr>
-            <w:tcW w:type="dxa" w:w="2160"/>
-          </w:tcPr>
-          <w:p>
-            <w:r>
-              <w:rPr>
-                <w:b/>
-                <w:sz w:val="20"/>
-              </w:rPr>
-              <w:t>Description</w:t>
-            </w:r>
-          </w:p>
-        </w:tc>
-      </w:tr>
-      <w:tr>
-        <w:tc>
-          <w:tcPr>
-            <w:tcW w:type="dxa" w:w="2160"/>
-          </w:tcPr>
-          <w:p>
-            <w:r>
-              <w:rPr>
-                <w:sz w:val="20"/>
-              </w:rPr>
-              <w:t>masterKey</w:t>
-            </w:r>
-          </w:p>
-        </w:tc>
-        <w:tc>
-          <w:tcPr>
-            <w:tcW w:type="dxa" w:w="2160"/>
-          </w:tcPr>
-          <w:p>
-            <w:r>
-              <w:rPr>
-                <w:sz w:val="20"/>
-              </w:rPr>
-              <w:t>Text</w:t>
-            </w:r>
-          </w:p>
-        </w:tc>
-        <w:tc>
-          <w:tcPr>
-            <w:tcW w:type="dxa" w:w="2160"/>
-          </w:tcPr>
-          <w:p>
-            <w:r>
-              <w:rPr>
-                <w:sz w:val="20"/>
-              </w:rPr>
-              <w:t>16 characters</w:t>
-            </w:r>
-          </w:p>
-        </w:tc>
-        <w:tc>
-          <w:tcPr>
-            <w:tcW w:type="dxa" w:w="2160"/>
-          </w:tcPr>
-          <w:p>
-            <w:r>
-              <w:rPr>
-                <w:sz w:val="20"/>
-              </w:rPr>
-              <w:t>Unique guest authentication key</w:t>
-            </w:r>
-          </w:p>
-        </w:tc>
-      </w:tr>
-      <w:tr>
-        <w:tc>
-          <w:tcPr>
-            <w:tcW w:type="dxa" w:w="2160"/>
-          </w:tcPr>
-          <w:p>
-            <w:r>
-              <w:rPr>
-                <w:sz w:val="20"/>
-              </w:rPr>
-              <w:t>roomNumber</w:t>
-            </w:r>
-          </w:p>
-        </w:tc>
-        <w:tc>
-          <w:tcPr>
-            <w:tcW w:type="dxa" w:w="2160"/>
-          </w:tcPr>
-          <w:p>
-            <w:r>
-              <w:rPr>
-                <w:sz w:val="20"/>
-              </w:rPr>
-              <w:t>Text</w:t>
-            </w:r>
-          </w:p>
-        </w:tc>
-        <w:tc>
-          <w:tcPr>
-            <w:tcW w:type="dxa" w:w="2160"/>
-          </w:tcPr>
-          <w:p>
-            <w:r>
-              <w:rPr>
-                <w:sz w:val="20"/>
-              </w:rPr>
-              <w:t>Variable</w:t>
-            </w:r>
-          </w:p>
-        </w:tc>
-        <w:tc>
-          <w:tcPr>
-            <w:tcW w:type="dxa" w:w="2160"/>
-          </w:tcPr>
-          <w:p>
-            <w:r>
-              <w:rPr>
-                <w:sz w:val="20"/>
-              </w:rPr>
-              <w:t>The room this key opens</w:t>
-            </w:r>
-          </w:p>
-        </w:tc>
-      </w:tr>
-      <w:tr>
-        <w:tc>
-          <w:tcPr>
-            <w:tcW w:type="dxa" w:w="2160"/>
-          </w:tcPr>
-          <w:p>
-            <w:r>
-              <w:rPr>
-                <w:sz w:val="20"/>
-              </w:rPr>
-              <w:t>checkIn</w:t>
-            </w:r>
-          </w:p>
-        </w:tc>
-        <w:tc>
-          <w:tcPr>
-            <w:tcW w:type="dxa" w:w="2160"/>
-          </w:tcPr>
-          <w:p>
-            <w:r>
-              <w:rPr>
-                <w:sz w:val="20"/>
-              </w:rPr>
-              <w:t>Text</w:t>
-            </w:r>
-          </w:p>
-        </w:tc>
-        <w:tc>
-          <w:tcPr>
-            <w:tcW w:type="dxa" w:w="2160"/>
-          </w:tcPr>
-          <w:p>
-            <w:r>
-              <w:rPr>
-                <w:sz w:val="20"/>
-              </w:rPr>
-              <w:t>yyyy-MM-dd HH:mm</w:t>
-            </w:r>
-          </w:p>
-        </w:tc>
-        <w:tc>
-          <w:tcPr>
-            <w:tcW w:type="dxa" w:w="2160"/>
-          </w:tcPr>
-          <w:p>
-            <w:r>
-              <w:rPr>
-                <w:sz w:val="20"/>
-              </w:rPr>
-              <w:t>When guest checked in</w:t>
-            </w:r>
-          </w:p>
-        </w:tc>
-      </w:tr>
-      <w:tr>
-        <w:tc>
-          <w:tcPr>
-            <w:tcW w:type="dxa" w:w="2160"/>
-          </w:tcPr>
-          <w:p>
-            <w:r>
-              <w:rPr>
-                <w:sz w:val="20"/>
-              </w:rPr>
-              <w:t>checkOut</w:t>
-            </w:r>
-          </w:p>
-        </w:tc>
-        <w:tc>
-          <w:tcPr>
-            <w:tcW w:type="dxa" w:w="2160"/>
-          </w:tcPr>
-          <w:p>
-            <w:r>
-              <w:rPr>
-                <w:sz w:val="20"/>
-              </w:rPr>
-              <w:t>Text</w:t>
-            </w:r>
-          </w:p>
-        </w:tc>
-        <w:tc>
-          <w:tcPr>
-            <w:tcW w:type="dxa" w:w="2160"/>
-          </w:tcPr>
-          <w:p>
-            <w:r>
-              <w:rPr>
-                <w:sz w:val="20"/>
-              </w:rPr>
-              <w:t>yyyy-MM-dd HH:mm</w:t>
-            </w:r>
-          </w:p>
-        </w:tc>
-        <w:tc>
-          <w:tcPr>
-            <w:tcW w:type="dxa" w:w="2160"/>
-          </w:tcPr>
-          <w:p>
-            <w:r>
-              <w:rPr>
-                <w:sz w:val="20"/>
-              </w:rPr>
-              <w:t>When guest checks out</w:t>
-            </w:r>
-          </w:p>
-        </w:tc>
-      </w:tr>
-      <w:tr>
-        <w:tc>
-          <w:tcPr>
-            <w:tcW w:type="dxa" w:w="2160"/>
-          </w:tcPr>
-          <w:p>
-            <w:r>
-              <w:rPr>
-                <w:sz w:val="20"/>
-              </w:rPr>
-              <w:t>timestamp</w:t>
-            </w:r>
-          </w:p>
-        </w:tc>
-        <w:tc>
-          <w:tcPr>
-            <w:tcW w:type="dxa" w:w="2160"/>
-          </w:tcPr>
-          <w:p>
-            <w:r>
-              <w:rPr>
-                <w:sz w:val="20"/>
-              </w:rPr>
-              <w:t>Number</w:t>
-            </w:r>
-          </w:p>
-        </w:tc>
-        <w:tc>
-          <w:tcPr>
-            <w:tcW w:type="dxa" w:w="2160"/>
-          </w:tcPr>
-          <w:p>
-            <w:r>
-              <w:rPr>
-                <w:sz w:val="20"/>
-              </w:rPr>
-              <w:t>Milliseconds since 1970</w:t>
-            </w:r>
-          </w:p>
-        </w:tc>
-        <w:tc>
-          <w:tcPr>
-            <w:tcW w:type="dxa" w:w="2160"/>
-          </w:tcPr>
-          <w:p>
-            <w:r>
-              <w:rPr>
-                <w:sz w:val="20"/>
-              </w:rPr>
-              <w:t>When this request was created</w:t>
-            </w:r>
-          </w:p>
-        </w:tc>
-      </w:tr>
-    </w:tbl>
-    <w:p>
-      <w:pPr>
-        <w:pStyle w:val="Heading2"/>
-      </w:pPr>
-      <w:r>
-        <w:rPr>
-          <w:color w:val="1A73E8"/>
-        </w:rPr>
-        <w:t>5.3 How JSON is Wrapped in NDEF</w:t>
-      </w:r>
-    </w:p>
-    <w:p>
-      <w:r>
-        <w:t>The JSON is not sent raw — it is wrapped in an NDEF Text Record. The NDEF file has this structure:</w:t>
+        <w:t>Required Settings:</w:t>
       </w:r>
     </w:p>
     <w:tbl>
@@ -2097,9 +473,8 @@
             <w:r>
               <w:rPr>
                 <w:b/>
-                <w:sz w:val="20"/>
               </w:rPr>
-              <w:t>Position</w:t>
+              <w:t>Setting</w:t>
             </w:r>
           </w:p>
         </w:tc>
@@ -2111,9 +486,8 @@
             <w:r>
               <w:rPr>
                 <w:b/>
-                <w:sz w:val="20"/>
               </w:rPr>
-              <w:t>What</w:t>
+              <w:t>Value</w:t>
             </w:r>
           </w:p>
         </w:tc>
@@ -2125,9 +499,8 @@
             <w:r>
               <w:rPr>
                 <w:b/>
-                <w:sz w:val="20"/>
               </w:rPr>
-              <w:t>Example</w:t>
+              <w:t>Why</w:t>
             </w:r>
           </w:p>
         </w:tc>
@@ -2139,10 +512,7 @@
           </w:tcPr>
           <w:p>
             <w:r>
-              <w:rPr>
-                <w:sz w:val="20"/>
-              </w:rPr>
-              <w:t>Bytes 0-1</w:t>
+              <w:t>SAK Byte</w:t>
             </w:r>
           </w:p>
         </w:tc>
@@ -2152,10 +522,7 @@
           </w:tcPr>
           <w:p>
             <w:r>
-              <w:rPr>
-                <w:sz w:val="20"/>
-              </w:rPr>
-              <w:t>Total message length (2 bytes, big-endian)</w:t>
+              <w:t>0x20</w:t>
             </w:r>
           </w:p>
         </w:tc>
@@ -2165,10 +532,7 @@
           </w:tcPr>
           <w:p>
             <w:r>
-              <w:rPr>
-                <w:sz w:val="20"/>
-              </w:rPr>
-              <w:t>00 8A (= 138 bytes)</w:t>
+              <w:t>Tells iPhone this is ISO 14443-4 compliant</w:t>
             </w:r>
           </w:p>
         </w:tc>
@@ -2180,10 +544,7 @@
           </w:tcPr>
           <w:p>
             <w:r>
-              <w:rPr>
-                <w:sz w:val="20"/>
-              </w:rPr>
-              <w:t>Byte 2</w:t>
+              <w:t>ATQA</w:t>
             </w:r>
           </w:p>
         </w:tc>
@@ -2193,10 +554,7 @@
           </w:tcPr>
           <w:p>
             <w:r>
-              <w:rPr>
-                <w:sz w:val="20"/>
-              </w:rPr>
-              <w:t>NDEF record header</w:t>
+              <w:t>0x0004</w:t>
             </w:r>
           </w:p>
         </w:tc>
@@ -2206,10 +564,7 @@
           </w:tcPr>
           <w:p>
             <w:r>
-              <w:rPr>
-                <w:sz w:val="20"/>
-              </w:rPr>
-              <w:t>D1 (Text record, short format)</w:t>
+              <w:t>Standard Type 4 Tag response</w:t>
             </w:r>
           </w:p>
         </w:tc>
@@ -2221,10 +576,7 @@
           </w:tcPr>
           <w:p>
             <w:r>
-              <w:rPr>
-                <w:sz w:val="20"/>
-              </w:rPr>
-              <w:t>Byte 3</w:t>
+              <w:t>NDEF AID</w:t>
             </w:r>
           </w:p>
         </w:tc>
@@ -2234,10 +586,7 @@
           </w:tcPr>
           <w:p>
             <w:r>
-              <w:rPr>
-                <w:sz w:val="20"/>
-              </w:rPr>
-              <w:t>Type length</w:t>
+              <w:t>D2 76 00 00 85 01 01</w:t>
             </w:r>
           </w:p>
         </w:tc>
@@ -2247,10 +596,7 @@
           </w:tcPr>
           <w:p>
             <w:r>
-              <w:rPr>
-                <w:sz w:val="20"/>
-              </w:rPr>
-              <w:t>01</w:t>
+              <w:t>iPhone sends SELECT for this AID first</w:t>
             </w:r>
           </w:p>
         </w:tc>
@@ -2262,10 +608,7 @@
           </w:tcPr>
           <w:p>
             <w:r>
-              <w:rPr>
-                <w:sz w:val="20"/>
-              </w:rPr>
-              <w:t>Byte 4</w:t>
+              <w:t>Historical Bytes</w:t>
             </w:r>
           </w:p>
         </w:tc>
@@ -2275,10 +618,7 @@
           </w:tcPr>
           <w:p>
             <w:r>
-              <w:rPr>
-                <w:sz w:val="20"/>
-              </w:rPr>
-              <w:t>Content length</w:t>
+              <w:t>Optional</w:t>
             </w:r>
           </w:p>
         </w:tc>
@@ -2288,293 +628,24 @@
           </w:tcPr>
           <w:p>
             <w:r>
-              <w:rPr>
-                <w:sz w:val="20"/>
-              </w:rPr>
-              <w:t>86 (= 134 bytes)</w:t>
-            </w:r>
-          </w:p>
-        </w:tc>
-      </w:tr>
-      <w:tr>
-        <w:tc>
-          <w:tcPr>
-            <w:tcW w:type="dxa" w:w="2880"/>
-          </w:tcPr>
-          <w:p>
-            <w:r>
-              <w:rPr>
-                <w:sz w:val="20"/>
-              </w:rPr>
-              <w:t>Byte 5</w:t>
-            </w:r>
-          </w:p>
-        </w:tc>
-        <w:tc>
-          <w:tcPr>
-            <w:tcW w:type="dxa" w:w="2880"/>
-          </w:tcPr>
-          <w:p>
-            <w:r>
-              <w:rPr>
-                <w:sz w:val="20"/>
-              </w:rPr>
-              <w:t>Type identifier: "T" for Text</w:t>
-            </w:r>
-          </w:p>
-        </w:tc>
-        <w:tc>
-          <w:tcPr>
-            <w:tcW w:type="dxa" w:w="2880"/>
-          </w:tcPr>
-          <w:p>
-            <w:r>
-              <w:rPr>
-                <w:sz w:val="20"/>
-              </w:rPr>
-              <w:t>54</w:t>
-            </w:r>
-          </w:p>
-        </w:tc>
-      </w:tr>
-      <w:tr>
-        <w:tc>
-          <w:tcPr>
-            <w:tcW w:type="dxa" w:w="2880"/>
-          </w:tcPr>
-          <w:p>
-            <w:r>
-              <w:rPr>
-                <w:sz w:val="20"/>
-              </w:rPr>
-              <w:t>Byte 6</w:t>
-            </w:r>
-          </w:p>
-        </w:tc>
-        <w:tc>
-          <w:tcPr>
-            <w:tcW w:type="dxa" w:w="2880"/>
-          </w:tcPr>
-          <w:p>
-            <w:r>
-              <w:rPr>
-                <w:sz w:val="20"/>
-              </w:rPr>
-              <w:t>Encoding info: UTF-8, language code = 2 chars</w:t>
-            </w:r>
-          </w:p>
-        </w:tc>
-        <w:tc>
-          <w:tcPr>
-            <w:tcW w:type="dxa" w:w="2880"/>
-          </w:tcPr>
-          <w:p>
-            <w:r>
-              <w:rPr>
-                <w:sz w:val="20"/>
-              </w:rPr>
-              <w:t>02</w:t>
-            </w:r>
-          </w:p>
-        </w:tc>
-      </w:tr>
-      <w:tr>
-        <w:tc>
-          <w:tcPr>
-            <w:tcW w:type="dxa" w:w="2880"/>
-          </w:tcPr>
-          <w:p>
-            <w:r>
-              <w:rPr>
-                <w:sz w:val="20"/>
-              </w:rPr>
-              <w:t>Bytes 7-8</w:t>
-            </w:r>
-          </w:p>
-        </w:tc>
-        <w:tc>
-          <w:tcPr>
-            <w:tcW w:type="dxa" w:w="2880"/>
-          </w:tcPr>
-          <w:p>
-            <w:r>
-              <w:rPr>
-                <w:sz w:val="20"/>
-              </w:rPr>
-              <w:t>Language code: "en"</w:t>
-            </w:r>
-          </w:p>
-        </w:tc>
-        <w:tc>
-          <w:tcPr>
-            <w:tcW w:type="dxa" w:w="2880"/>
-          </w:tcPr>
-          <w:p>
-            <w:r>
-              <w:rPr>
-                <w:sz w:val="20"/>
-              </w:rPr>
-              <w:t>65 6E</w:t>
-            </w:r>
-          </w:p>
-        </w:tc>
-      </w:tr>
-      <w:tr>
-        <w:tc>
-          <w:tcPr>
-            <w:tcW w:type="dxa" w:w="2880"/>
-          </w:tcPr>
-          <w:p>
-            <w:r>
-              <w:rPr>
-                <w:sz w:val="20"/>
-              </w:rPr>
-              <w:t>Bytes 9+</w:t>
-            </w:r>
-          </w:p>
-        </w:tc>
-        <w:tc>
-          <w:tcPr>
-            <w:tcW w:type="dxa" w:w="2880"/>
-          </w:tcPr>
-          <w:p>
-            <w:r>
-              <w:rPr>
-                <w:sz w:val="20"/>
-              </w:rPr>
-              <w:t>The JSON string (UTF-8)</w:t>
-            </w:r>
-          </w:p>
-        </w:tc>
-        <w:tc>
-          <w:tcPr>
-            <w:tcW w:type="dxa" w:w="2880"/>
-          </w:tcPr>
-          <w:p>
-            <w:r>
-              <w:rPr>
-                <w:sz w:val="20"/>
-              </w:rPr>
-              <w:t>{"masterKey":"..."}</w:t>
+              <w:t>Can be empty or contain version info</w:t>
             </w:r>
           </w:p>
         </w:tc>
       </w:tr>
     </w:tbl>
-    <w:p/>
-    <w:p>
-      <w:r>
-        <w:t>To extract the JSON from the NDEF file:</w:t>
-      </w:r>
-    </w:p>
-    <w:p>
-      <w:pPr>
-        <w:pStyle w:val="ListBullet"/>
-      </w:pPr>
-      <w:r>
-        <w:t>Read the length from bytes 0-1.</w:t>
-      </w:r>
-    </w:p>
-    <w:p>
-      <w:pPr>
-        <w:pStyle w:val="ListBullet"/>
-      </w:pPr>
-      <w:r>
-        <w:t>Skip to byte 9 (that is: 2 bytes length + 1 header + 1 type length + 1 content length + 1 type + 1 encoding + 2 language = 9 bytes).</w:t>
-      </w:r>
-    </w:p>
-    <w:p>
-      <w:pPr>
-        <w:pStyle w:val="ListBullet"/>
-      </w:pPr>
-      <w:r>
-        <w:t>Read the remaining bytes as a UTF-8 text string — that is your JSON.</w:t>
-      </w:r>
-    </w:p>
-    <w:p>
-      <w:r>
-        <w:rPr>
-          <w:i/>
-          <w:color w:val="86868B"/>
-          <w:sz w:val="20"/>
-        </w:rPr>
-        <w:t>The skip offset may vary slightly if the language code is different than "en". Always read byte 6 to get the language code length, then skip accordingly.</w:t>
-      </w:r>
-    </w:p>
     <w:p>
       <w:pPr>
         <w:pStyle w:val="Heading1"/>
       </w:pPr>
       <w:r>
-        <w:rPr>
-          <w:color w:val="1A73E8"/>
-        </w:rPr>
-        <w:t>6. Supporting Both iPhone and Android</w:t>
+        <w:t>6. What iPhone Sends (When in Target Mode)</w:t>
       </w:r>
     </w:p>
     <w:p>
       <w:r>
-        <w:t>The reader firmware should alternate between the two modes:</w:t>
-      </w:r>
-    </w:p>
-    <w:p>
-      <w:r>
-        <w:rPr>
-          <w:rFonts w:ascii="Courier New" w:hAnsi="Courier New"/>
-          <w:sz w:val="18"/>
-        </w:rPr>
-        <w:t xml:space="preserve">  MAIN LOOP:</w:t>
+        <w:t>When the iPhone detects the PN532 as a tag, it sends these commands in order:</w:t>
         <w:br/>
-        <w:t xml:space="preserve">  +-----------------------------------------+</w:t>
-        <w:br/>
-        <w:t xml:space="preserve">  |                                         |</w:t>
-        <w:br/>
-        <w:t xml:space="preserve">  |  1. Try Reader Mode (for Android)       |</w:t>
-        <w:br/>
-        <w:t xml:space="preserve">  |     - Scan for NFC cards nearby          |</w:t>
-        <w:br/>
-        <w:t xml:space="preserve">  |     - If Android phone found:            |</w:t>
-        <w:br/>
-        <w:t xml:space="preserve">  |       Read guest data from HCE           |</w:t>
-        <w:br/>
-        <w:t xml:space="preserve">  |       Process and unlock                 |</w:t>
-        <w:br/>
-        <w:t xml:space="preserve">  |                                         |</w:t>
-        <w:br/>
-        <w:t xml:space="preserve">  |  2. Try Tag Mode (for iPhone)            |</w:t>
-        <w:br/>
-        <w:t xml:space="preserve">  |     - Switch to Target Mode              |</w:t>
-        <w:br/>
-        <w:t xml:space="preserve">  |     - Wait briefly for iPhone to write   |</w:t>
-        <w:br/>
-        <w:t xml:space="preserve">  |     - If data received:                  |</w:t>
-        <w:br/>
-        <w:t xml:space="preserve">  |       Extract JSON from NDEF             |</w:t>
-        <w:br/>
-        <w:t xml:space="preserve">  |       Process and unlock                 |</w:t>
-        <w:br/>
-        <w:t xml:space="preserve">  |                                         |</w:t>
-        <w:br/>
-        <w:t xml:space="preserve">  |  3. Repeat                               |</w:t>
-        <w:br/>
-        <w:t xml:space="preserve">  +-----------------------------------------+</w:t>
-        <w:br/>
-      </w:r>
-    </w:p>
-    <w:p>
-      <w:r>
-        <w:t>The recommended timing is 500ms for each mode attempt, giving a total cycle time of about 1 second. This ensures quick response regardless of which phone type the guest uses.</w:t>
-      </w:r>
-    </w:p>
-    <w:p>
-      <w:pPr>
-        <w:pStyle w:val="Heading1"/>
-      </w:pPr>
-      <w:r>
-        <w:rPr>
-          <w:color w:val="1A73E8"/>
-        </w:rPr>
-        <w:t>7. Common Issues</w:t>
       </w:r>
     </w:p>
     <w:tbl>
@@ -2598,9 +669,8 @@
             <w:r>
               <w:rPr>
                 <w:b/>
-                <w:sz w:val="20"/>
               </w:rPr>
-              <w:t>Problem</w:t>
+              <w:t>Step</w:t>
             </w:r>
           </w:p>
         </w:tc>
@@ -2612,9 +682,8 @@
             <w:r>
               <w:rPr>
                 <w:b/>
-                <w:sz w:val="20"/>
               </w:rPr>
-              <w:t>Cause</w:t>
+              <w:t>iPhone Sends</w:t>
             </w:r>
           </w:p>
         </w:tc>
@@ -2626,9 +695,8 @@
             <w:r>
               <w:rPr>
                 <w:b/>
-                <w:sz w:val="20"/>
               </w:rPr>
-              <w:t>Fix</w:t>
+              <w:t>PN532 Must Respond</w:t>
             </w:r>
           </w:p>
         </w:tc>
@@ -2640,10 +708,7 @@
           </w:tcPr>
           <w:p>
             <w:r>
-              <w:rPr>
-                <w:sz w:val="20"/>
-              </w:rPr>
-              <w:t>iPhone does not detect the reader</w:t>
+              <w:t>1</w:t>
             </w:r>
           </w:p>
         </w:tc>
@@ -2653,10 +718,9 @@
           </w:tcPr>
           <w:p>
             <w:r>
-              <w:rPr>
-                <w:sz w:val="20"/>
-              </w:rPr>
-              <w:t>SAK byte is wrong</w:t>
+              <w:t>SELECT NDEF AID</w:t>
+              <w:br/>
+              <w:t>00 A4 04 00 07 D2760000850101 00</w:t>
             </w:r>
           </w:p>
         </w:tc>
@@ -2666,10 +730,7 @@
           </w:tcPr>
           <w:p>
             <w:r>
-              <w:rPr>
-                <w:sz w:val="20"/>
-              </w:rPr>
-              <w:t>SAK must be 0x20 (bit 6 set). This is the most common issue.</w:t>
+              <w:t>Success: 90 00</w:t>
             </w:r>
           </w:p>
         </w:tc>
@@ -2681,10 +742,7 @@
           </w:tcPr>
           <w:p>
             <w:r>
-              <w:rPr>
-                <w:sz w:val="20"/>
-              </w:rPr>
-              <w:t>iPhone says "Tag not supported"</w:t>
+              <w:t>2</w:t>
             </w:r>
           </w:p>
         </w:tc>
@@ -2694,10 +752,9 @@
           </w:tcPr>
           <w:p>
             <w:r>
-              <w:rPr>
-                <w:sz w:val="20"/>
-              </w:rPr>
-              <w:t>Capability Container file is wrong</w:t>
+              <w:t>SELECT CC File</w:t>
+              <w:br/>
+              <w:t>00 A4 00 0C 02 E103</w:t>
             </w:r>
           </w:p>
         </w:tc>
@@ -2707,10 +764,7 @@
           </w:tcPr>
           <w:p>
             <w:r>
-              <w:rPr>
-                <w:sz w:val="20"/>
-              </w:rPr>
-              <w:t>Check that the CC file is exactly: 00 0F 20 00 FF 00 FF 04 06 E1 04 04 00 00 00</w:t>
+              <w:t>Success: 90 00</w:t>
             </w:r>
           </w:p>
         </w:tc>
@@ -2722,10 +776,7 @@
           </w:tcPr>
           <w:p>
             <w:r>
-              <w:rPr>
-                <w:sz w:val="20"/>
-              </w:rPr>
-              <w:t>iPhone says "Tag not writable"</w:t>
+              <w:t>3</w:t>
             </w:r>
           </w:p>
         </w:tc>
@@ -2735,10 +786,9 @@
           </w:tcPr>
           <w:p>
             <w:r>
-              <w:rPr>
-                <w:sz w:val="20"/>
-              </w:rPr>
-              <w:t>Write access is blocked in CC</w:t>
+              <w:t>READ CC File</w:t>
+              <w:br/>
+              <w:t>00 B0 00 00 0F</w:t>
             </w:r>
           </w:p>
         </w:tc>
@@ -2748,10 +798,9 @@
           </w:tcPr>
           <w:p>
             <w:r>
-              <w:rPr>
-                <w:sz w:val="20"/>
-              </w:rPr>
-              <w:t>Byte 14 of CC must be 00 (open access)</w:t>
+              <w:t>Return 15 bytes:</w:t>
+              <w:br/>
+              <w:t>00 0F 20 00 FF 00 FF 04 06 E1 04 04 00 00 00</w:t>
             </w:r>
           </w:p>
         </w:tc>
@@ -2763,10 +812,7 @@
           </w:tcPr>
           <w:p>
             <w:r>
-              <w:rPr>
-                <w:sz w:val="20"/>
-              </w:rPr>
-              <w:t>Data arrives but is incomplete</w:t>
+              <w:t>4</w:t>
             </w:r>
           </w:p>
         </w:tc>
@@ -2776,10 +822,9 @@
           </w:tcPr>
           <w:p>
             <w:r>
-              <w:rPr>
-                <w:sz w:val="20"/>
-              </w:rPr>
-              <w:t>Processing data too early</w:t>
+              <w:t>SELECT NDEF File</w:t>
+              <w:br/>
+              <w:t>00 A4 00 0C 02 E104</w:t>
             </w:r>
           </w:p>
         </w:tc>
@@ -2789,10 +834,7 @@
           </w:tcPr>
           <w:p>
             <w:r>
-              <w:rPr>
-                <w:sz w:val="20"/>
-              </w:rPr>
-              <w:t>Only process when WRITE at position 0 has length &gt; 0 (step 3)</w:t>
+              <w:t>Success: 90 00</w:t>
             </w:r>
           </w:p>
         </w:tc>
@@ -2804,10 +846,7 @@
           </w:tcPr>
           <w:p>
             <w:r>
-              <w:rPr>
-                <w:sz w:val="20"/>
-              </w:rPr>
-              <w:t>JSON looks garbled</w:t>
+              <w:t>5</w:t>
             </w:r>
           </w:p>
         </w:tc>
@@ -2817,10 +856,9 @@
           </w:tcPr>
           <w:p>
             <w:r>
-              <w:rPr>
-                <w:sz w:val="20"/>
-              </w:rPr>
-              <w:t>Not skipping NDEF header bytes</w:t>
+              <w:t>UPDATE BINARY (write NDEF data)</w:t>
+              <w:br/>
+              <w:t>00 D6 00 00 LEN [data]</w:t>
             </w:r>
           </w:p>
         </w:tc>
@@ -2830,100 +868,57 @@
           </w:tcPr>
           <w:p>
             <w:r>
-              <w:rPr>
-                <w:sz w:val="20"/>
-              </w:rPr>
-              <w:t>Skip the first 7 bytes of the NDEF record to get to the JSON</w:t>
-            </w:r>
-          </w:p>
-        </w:tc>
-      </w:tr>
-      <w:tr>
-        <w:tc>
-          <w:tcPr>
-            <w:tcW w:type="dxa" w:w="2880"/>
-          </w:tcPr>
-          <w:p>
-            <w:r>
-              <w:rPr>
-                <w:sz w:val="20"/>
-              </w:rPr>
-              <w:t>Works with Android but not iPhone</w:t>
-            </w:r>
-          </w:p>
-        </w:tc>
-        <w:tc>
-          <w:tcPr>
-            <w:tcW w:type="dxa" w:w="2880"/>
-          </w:tcPr>
-          <w:p>
-            <w:r>
-              <w:rPr>
-                <w:sz w:val="20"/>
-              </w:rPr>
-              <w:t>Reader is not in Tag Mode</w:t>
-            </w:r>
-          </w:p>
-        </w:tc>
-        <w:tc>
-          <w:tcPr>
-            <w:tcW w:type="dxa" w:w="2880"/>
-          </w:tcPr>
-          <w:p>
-            <w:r>
-              <w:rPr>
-                <w:sz w:val="20"/>
-              </w:rPr>
-              <w:t>Must use TgInitAsTarget to enter Tag Mode for iPhone</w:t>
-            </w:r>
-          </w:p>
-        </w:tc>
-      </w:tr>
-      <w:tr>
-        <w:tc>
-          <w:tcPr>
-            <w:tcW w:type="dxa" w:w="2880"/>
-          </w:tcPr>
-          <w:p>
-            <w:r>
-              <w:rPr>
-                <w:sz w:val="20"/>
-              </w:rPr>
-              <w:t>iPhone connects but write fails</w:t>
-            </w:r>
-          </w:p>
-        </w:tc>
-        <w:tc>
-          <w:tcPr>
-            <w:tcW w:type="dxa" w:w="2880"/>
-          </w:tcPr>
-          <w:p>
-            <w:r>
-              <w:rPr>
-                <w:sz w:val="20"/>
-              </w:rPr>
-              <w:t>Buffer too small</w:t>
-            </w:r>
-          </w:p>
-        </w:tc>
-        <w:tc>
-          <w:tcPr>
-            <w:tcW w:type="dxa" w:w="2880"/>
-          </w:tcPr>
-          <w:p>
-            <w:r>
-              <w:rPr>
-                <w:sz w:val="20"/>
-              </w:rPr>
-              <w:t>NDEF buffer must be at least 1024 bytes (as declared in CC)</w:t>
+              <w:t>Success: 90 00</w:t>
+              <w:br/>
+              <w:t>Store the NDEF data!</w:t>
             </w:r>
           </w:p>
         </w:tc>
       </w:tr>
     </w:tbl>
     <w:p>
+      <w:pPr>
+        <w:pStyle w:val="Heading1"/>
+      </w:pPr>
       <w:r>
-        <w:br w:type="page"/>
+        <w:t>7. Data the iPhone Writes</w:t>
+      </w:r>
+    </w:p>
+    <w:p>
+      <w:r>
+        <w:t>The iPhone writes an NDEF Text Record containing JSON:</w:t>
+        <w:br/>
+      </w:r>
+    </w:p>
+    <w:p>
+      <w:r>
+        <w:t xml:space="preserve">  {</w:t>
+        <w:br/>
+        <w:t xml:space="preserve">    "masterKey": "ABCD1234",</w:t>
+        <w:br/>
+        <w:t xml:space="preserve">    "roomNumber": "405",</w:t>
+        <w:br/>
+        <w:t xml:space="preserve">    "checkIn": "2026-03-01",</w:t>
+        <w:br/>
+        <w:t xml:space="preserve">    "checkOut": "2026-03-05"</w:t>
+        <w:br/>
+        <w:t xml:space="preserve">  }</w:t>
+        <w:br/>
+        <w:br/>
+        <w:t>This is wrapped in NDEF format:</w:t>
+        <w:br/>
+        <w:t xml:space="preserve">  [NDEF Length (2 bytes)] [NDEF Header] [Status Byte + "en" + JSON text]</w:t>
+        <w:br/>
+        <w:br/>
+        <w:t>The PN532 should:</w:t>
+        <w:br/>
+        <w:t xml:space="preserve">  1. Extract the JSON text from the NDEF record</w:t>
+        <w:br/>
+        <w:t xml:space="preserve">  2. Parse the JSON fields</w:t>
+        <w:br/>
+        <w:t xml:space="preserve">  3. Use masterKey + roomNumber to verify access</w:t>
+        <w:br/>
+        <w:t xml:space="preserve">  4. Check current date is between checkIn and checkOut</w:t>
       </w:r>
     </w:p>
     <w:p>
@@ -2931,21 +926,38 @@
         <w:pStyle w:val="Heading1"/>
       </w:pPr>
       <w:r>
-        <w:rPr>
-          <w:color w:val="1A73E8"/>
-        </w:rPr>
-        <w:t>8. Quick Reference Card</w:t>
+        <w:t>8. How iPhone Writes (3-Step Process)</w:t>
+      </w:r>
+    </w:p>
+    <w:p>
+      <w:r>
+        <w:t>The iPhone uses the NFC Forum Type 4 Tag write procedure:</w:t>
+        <w:br/>
+        <w:br/>
+        <w:t xml:space="preserve">  Step 1 — Invalidate: Write length = 0000 at offset 0</w:t>
+        <w:br/>
+        <w:t xml:space="preserve">           (tells reader: data is being written, not valid yet)</w:t>
+        <w:br/>
+        <w:br/>
+        <w:t xml:space="preserve">  Step 2 — Write Data: Write actual NDEF bytes at offset 2+</w:t>
+        <w:br/>
+        <w:t xml:space="preserve">           (the guest access JSON data)</w:t>
+        <w:br/>
+        <w:br/>
+        <w:t xml:space="preserve">  Step 3 — Finalize: Write real length at offset 0</w:t>
+        <w:br/>
+        <w:t xml:space="preserve">           (tells reader: data is now complete and valid)</w:t>
+        <w:br/>
+        <w:br/>
+        <w:t>The PN532 should only process the data after Step 3 (when the length at offset 0 changes from 0000 to the real value).</w:t>
       </w:r>
     </w:p>
     <w:p>
       <w:pPr>
-        <w:pStyle w:val="Heading2"/>
+        <w:pStyle w:val="Heading1"/>
       </w:pPr>
       <w:r>
-        <w:rPr>
-          <w:color w:val="1A73E8"/>
-        </w:rPr>
-        <w:t>Reader Requirements</w:t>
+        <w:t>9. Quick Reference Card</w:t>
       </w:r>
     </w:p>
     <w:tbl>
@@ -2968,9 +980,8 @@
             <w:r>
               <w:rPr>
                 <w:b/>
-                <w:sz w:val="20"/>
               </w:rPr>
-              <w:t>Requirement</w:t>
+              <w:t>Item</w:t>
             </w:r>
           </w:p>
         </w:tc>
@@ -2982,7 +993,6 @@
             <w:r>
               <w:rPr>
                 <w:b/>
-                <w:sz w:val="20"/>
               </w:rPr>
               <w:t>Value</w:t>
             </w:r>
@@ -2996,10 +1006,7 @@
           </w:tcPr>
           <w:p>
             <w:r>
-              <w:rPr>
-                <w:sz w:val="20"/>
-              </w:rPr>
-              <w:t>Module</w:t>
+              <w:t>PN532 Mode for iPhone</w:t>
             </w:r>
           </w:p>
         </w:tc>
@@ -3009,10 +1016,7 @@
           </w:tcPr>
           <w:p>
             <w:r>
-              <w:rPr>
-                <w:sz w:val="20"/>
-              </w:rPr>
-              <w:t>PN532 V3 (or compatible)</w:t>
+              <w:t>TgInitAsTarget (0x8C) — Target Mode</w:t>
             </w:r>
           </w:p>
         </w:tc>
@@ -3024,10 +1028,7 @@
           </w:tcPr>
           <w:p>
             <w:r>
-              <w:rPr>
-                <w:sz w:val="20"/>
-              </w:rPr>
-              <w:t>Mode for iPhone</w:t>
+              <w:t>PN532 Mode for Cards</w:t>
             </w:r>
           </w:p>
         </w:tc>
@@ -3037,10 +1038,7 @@
           </w:tcPr>
           <w:p>
             <w:r>
-              <w:rPr>
-                <w:sz w:val="20"/>
-              </w:rPr>
-              <w:t>Target Mode (TgInitAsTarget)</w:t>
+              <w:t>InListPassiveTarget (0x4A) — Reader Mode</w:t>
             </w:r>
           </w:p>
         </w:tc>
@@ -3052,10 +1050,7 @@
           </w:tcPr>
           <w:p>
             <w:r>
-              <w:rPr>
-                <w:sz w:val="20"/>
-              </w:rPr>
-              <w:t>Mode for Android</w:t>
+              <w:t>Loop Timing</w:t>
             </w:r>
           </w:p>
         </w:tc>
@@ -3065,10 +1060,7 @@
           </w:tcPr>
           <w:p>
             <w:r>
-              <w:rPr>
-                <w:sz w:val="20"/>
-              </w:rPr>
-              <w:t>Initiator Mode (InListPassiveTarget)</w:t>
+              <w:t>Target 500ms → Reader 20ms → repeat</w:t>
             </w:r>
           </w:p>
         </w:tc>
@@ -3080,10 +1072,7 @@
           </w:tcPr>
           <w:p>
             <w:r>
-              <w:rPr>
-                <w:sz w:val="20"/>
-              </w:rPr>
-              <w:t>SAK</w:t>
+              <w:t>SAK Byte</w:t>
             </w:r>
           </w:p>
         </w:tc>
@@ -3093,9 +1082,6 @@
           </w:tcPr>
           <w:p>
             <w:r>
-              <w:rPr>
-                <w:sz w:val="20"/>
-              </w:rPr>
               <w:t>0x20</w:t>
             </w:r>
           </w:p>
@@ -3108,10 +1094,7 @@
           </w:tcPr>
           <w:p>
             <w:r>
-              <w:rPr>
-                <w:sz w:val="20"/>
-              </w:rPr>
-              <w:t>NFC Standard</w:t>
+              <w:t>NDEF AID</w:t>
             </w:r>
           </w:p>
         </w:tc>
@@ -3121,10 +1104,7 @@
           </w:tcPr>
           <w:p>
             <w:r>
-              <w:rPr>
-                <w:sz w:val="20"/>
-              </w:rPr>
-              <w:t>ISO 14443-A, NFC Forum Type 4 Tag v2.0</w:t>
+              <w:t>D2 76 00 00 85 01 01</w:t>
             </w:r>
           </w:p>
         </w:tc>
@@ -3136,10 +1116,7 @@
           </w:tcPr>
           <w:p>
             <w:r>
-              <w:rPr>
-                <w:sz w:val="20"/>
-              </w:rPr>
-              <w:t>Buffer size</w:t>
+              <w:t>CC File (15 bytes)</w:t>
             </w:r>
           </w:p>
         </w:tc>
@@ -3149,10 +1126,7 @@
           </w:tcPr>
           <w:p>
             <w:r>
-              <w:rPr>
-                <w:sz w:val="20"/>
-              </w:rPr>
-              <w:t>Minimum 1024 bytes</w:t>
+              <w:t>00 0F 20 00 FF 00 FF 04 06 E1 04 04 00 00 00</w:t>
             </w:r>
           </w:p>
         </w:tc>
@@ -3164,10 +1138,7 @@
           </w:tcPr>
           <w:p>
             <w:r>
-              <w:rPr>
-                <w:sz w:val="20"/>
-              </w:rPr>
-              <w:t>Interface</w:t>
+              <w:t>Data Ready Signal</w:t>
             </w:r>
           </w:p>
         </w:tc>
@@ -3177,38 +1148,7 @@
           </w:tcPr>
           <w:p>
             <w:r>
-              <w:rPr>
-                <w:sz w:val="20"/>
-              </w:rPr>
-              <w:t>SPI, I2C, or HSU (your choice)</w:t>
-            </w:r>
-          </w:p>
-        </w:tc>
-      </w:tr>
-      <w:tr>
-        <w:tc>
-          <w:tcPr>
-            <w:tcW w:type="dxa" w:w="4320"/>
-          </w:tcPr>
-          <w:p>
-            <w:r>
-              <w:rPr>
-                <w:sz w:val="20"/>
-              </w:rPr>
-              <w:t>Range</w:t>
-            </w:r>
-          </w:p>
-        </w:tc>
-        <w:tc>
-          <w:tcPr>
-            <w:tcW w:type="dxa" w:w="4320"/>
-          </w:tcPr>
-          <w:p>
-            <w:r>
-              <w:rPr>
-                <w:sz w:val="20"/>
-              </w:rPr>
-              <w:t>5-7 cm</w:t>
+              <w:t>NDEF length at offset 0 changes from 0000 to real value</w:t>
             </w:r>
           </w:p>
         </w:tc>
@@ -3216,53 +1156,10 @@
     </w:tbl>
     <w:p>
       <w:pPr>
-        <w:pStyle w:val="Heading2"/>
+        <w:pStyle w:val="Heading1"/>
       </w:pPr>
       <w:r>
-        <w:rPr>
-          <w:color w:val="1A73E8"/>
-        </w:rPr>
-        <w:t>CC File (Always Same)</w:t>
-      </w:r>
-    </w:p>
-    <w:p>
-      <w:r>
-        <w:rPr>
-          <w:rFonts w:ascii="Courier New" w:hAnsi="Courier New"/>
-          <w:sz w:val="18"/>
-        </w:rPr>
-        <w:t>00 0F 20 00 FF 00 FF 04 06 E1 04 04 00 00 00</w:t>
-      </w:r>
-    </w:p>
-    <w:p>
-      <w:pPr>
-        <w:pStyle w:val="Heading2"/>
-      </w:pPr>
-      <w:r>
-        <w:rPr>
-          <w:color w:val="1A73E8"/>
-        </w:rPr>
-        <w:t>NDEF Application ID (AID)</w:t>
-      </w:r>
-    </w:p>
-    <w:p>
-      <w:r>
-        <w:rPr>
-          <w:rFonts w:ascii="Courier New" w:hAnsi="Courier New"/>
-          <w:sz w:val="18"/>
-        </w:rPr>
-        <w:t>D2 76 00 00 85 01 01</w:t>
-      </w:r>
-    </w:p>
-    <w:p>
-      <w:pPr>
-        <w:pStyle w:val="Heading2"/>
-      </w:pPr>
-      <w:r>
-        <w:rPr>
-          <w:color w:val="1A73E8"/>
-        </w:rPr>
-        <w:t>File IDs</w:t>
+        <w:t>10. Troubleshooting</w:t>
       </w:r>
     </w:p>
     <w:tbl>
@@ -3273,35 +1170,47 @@
         <w:tblLook w:firstColumn="1" w:firstRow="1" w:lastColumn="0" w:lastRow="0" w:noHBand="0" w:noVBand="1" w:val="04A0"/>
       </w:tblPr>
       <w:tblGrid>
-        <w:gridCol w:w="4320"/>
-        <w:gridCol w:w="4320"/>
+        <w:gridCol w:w="2880"/>
+        <w:gridCol w:w="2880"/>
+        <w:gridCol w:w="2880"/>
       </w:tblGrid>
       <w:tr>
         <w:tc>
           <w:tcPr>
-            <w:tcW w:type="dxa" w:w="4320"/>
+            <w:tcW w:type="dxa" w:w="2880"/>
           </w:tcPr>
           <w:p>
             <w:r>
               <w:rPr>
                 <w:b/>
-                <w:sz w:val="20"/>
               </w:rPr>
-              <w:t>File</w:t>
+              <w:t>Problem</w:t>
             </w:r>
           </w:p>
         </w:tc>
         <w:tc>
           <w:tcPr>
-            <w:tcW w:type="dxa" w:w="4320"/>
+            <w:tcW w:type="dxa" w:w="2880"/>
           </w:tcPr>
           <w:p>
             <w:r>
               <w:rPr>
                 <w:b/>
-                <w:sz w:val="20"/>
               </w:rPr>
-              <w:t>ID</w:t>
+              <w:t>Cause</w:t>
+            </w:r>
+          </w:p>
+        </w:tc>
+        <w:tc>
+          <w:tcPr>
+            <w:tcW w:type="dxa" w:w="2880"/>
+          </w:tcPr>
+          <w:p>
+            <w:r>
+              <w:rPr>
+                <w:b/>
+              </w:rPr>
+              <w:t>Fix</w:t>
             </w:r>
           </w:p>
         </w:tc>
@@ -3309,27 +1218,31 @@
       <w:tr>
         <w:tc>
           <w:tcPr>
-            <w:tcW w:type="dxa" w:w="4320"/>
+            <w:tcW w:type="dxa" w:w="2880"/>
           </w:tcPr>
           <w:p>
             <w:r>
-              <w:rPr>
-                <w:sz w:val="20"/>
-              </w:rPr>
-              <w:t>Capability Container</w:t>
+              <w:t>Apple Wallet opens instead of app</w:t>
             </w:r>
           </w:p>
         </w:tc>
         <w:tc>
           <w:tcPr>
-            <w:tcW w:type="dxa" w:w="4320"/>
+            <w:tcW w:type="dxa" w:w="2880"/>
           </w:tcPr>
           <w:p>
             <w:r>
-              <w:rPr>
-                <w:sz w:val="20"/>
-              </w:rPr>
-              <w:t>E1 03</w:t>
+              <w:t>PN532 is in Reader Mode when iPhone taps (generating RF)</w:t>
+            </w:r>
+          </w:p>
+        </w:tc>
+        <w:tc>
+          <w:tcPr>
+            <w:tcW w:type="dxa" w:w="2880"/>
+          </w:tcPr>
+          <w:p>
+            <w:r>
+              <w:t>PN532 must be in Target Mode. Use dual-mode loop with Target first.</w:t>
             </w:r>
           </w:p>
         </w:tc>
@@ -3337,96 +1250,31 @@
       <w:tr>
         <w:tc>
           <w:tcPr>
-            <w:tcW w:type="dxa" w:w="4320"/>
+            <w:tcW w:type="dxa" w:w="2880"/>
           </w:tcPr>
           <w:p>
             <w:r>
-              <w:rPr>
-                <w:sz w:val="20"/>
-              </w:rPr>
-              <w:t>NDEF Data</w:t>
+              <w:t>iPhone shows "No tag found"</w:t>
             </w:r>
           </w:p>
         </w:tc>
         <w:tc>
           <w:tcPr>
-            <w:tcW w:type="dxa" w:w="4320"/>
+            <w:tcW w:type="dxa" w:w="2880"/>
           </w:tcPr>
           <w:p>
             <w:r>
-              <w:rPr>
-                <w:sz w:val="20"/>
-              </w:rPr>
-              <w:t>E1 04</w:t>
-            </w:r>
-          </w:p>
-        </w:tc>
-      </w:tr>
-    </w:tbl>
-    <w:p>
-      <w:pPr>
-        <w:pStyle w:val="Heading2"/>
-      </w:pPr>
-      <w:r>
-        <w:rPr>
-          <w:color w:val="1A73E8"/>
-        </w:rPr>
-        <w:t>Data Trigger</w:t>
-      </w:r>
-    </w:p>
-    <w:p>
-      <w:r>
-        <w:t>WRITE at position 0 with length &gt; 0 = data is complete. Process it now.</w:t>
-      </w:r>
-    </w:p>
-    <w:p>
-      <w:pPr>
-        <w:pStyle w:val="Heading2"/>
-      </w:pPr>
-      <w:r>
-        <w:rPr>
-          <w:color w:val="1A73E8"/>
-        </w:rPr>
-        <w:t>JSON Fields</w:t>
-      </w:r>
-    </w:p>
-    <w:tbl>
-      <w:tblPr>
-        <w:tblStyle w:val="LightGrid-Accent1"/>
-        <w:tblW w:type="auto" w:w="0"/>
-        <w:jc w:val="center"/>
-        <w:tblLook w:firstColumn="1" w:firstRow="1" w:lastColumn="0" w:lastRow="0" w:noHBand="0" w:noVBand="1" w:val="04A0"/>
-      </w:tblPr>
-      <w:tblGrid>
-        <w:gridCol w:w="4320"/>
-        <w:gridCol w:w="4320"/>
-      </w:tblGrid>
-      <w:tr>
-        <w:tc>
-          <w:tcPr>
-            <w:tcW w:type="dxa" w:w="4320"/>
-          </w:tcPr>
-          <w:p>
-            <w:r>
-              <w:rPr>
-                <w:b/>
-                <w:sz w:val="20"/>
-              </w:rPr>
-              <w:t>Field</w:t>
+              <w:t>SAK byte is not 0x20</w:t>
             </w:r>
           </w:p>
         </w:tc>
         <w:tc>
           <w:tcPr>
-            <w:tcW w:type="dxa" w:w="4320"/>
+            <w:tcW w:type="dxa" w:w="2880"/>
           </w:tcPr>
           <w:p>
             <w:r>
-              <w:rPr>
-                <w:b/>
-                <w:sz w:val="20"/>
-              </w:rPr>
-              <w:t>Example</w:t>
+              <w:t>Set SAK = 0x20 in TgInitAsTarget parameters</w:t>
             </w:r>
           </w:p>
         </w:tc>
@@ -3434,27 +1282,31 @@
       <w:tr>
         <w:tc>
           <w:tcPr>
-            <w:tcW w:type="dxa" w:w="4320"/>
+            <w:tcW w:type="dxa" w:w="2880"/>
           </w:tcPr>
           <w:p>
             <w:r>
-              <w:rPr>
-                <w:sz w:val="20"/>
-              </w:rPr>
-              <w:t>masterKey</w:t>
+              <w:t>iPhone connects but write fails</w:t>
             </w:r>
           </w:p>
         </w:tc>
         <w:tc>
           <w:tcPr>
-            <w:tcW w:type="dxa" w:w="4320"/>
+            <w:tcW w:type="dxa" w:w="2880"/>
           </w:tcPr>
           <w:p>
             <w:r>
-              <w:rPr>
-                <w:sz w:val="20"/>
-              </w:rPr>
-              <w:t>A1B2C3D4E5F6G7H8</w:t>
+              <w:t>CC file missing or wrong bytes</w:t>
+            </w:r>
+          </w:p>
+        </w:tc>
+        <w:tc>
+          <w:tcPr>
+            <w:tcW w:type="dxa" w:w="2880"/>
+          </w:tcPr>
+          <w:p>
+            <w:r>
+              <w:t>Return exact 15 bytes: 00 0F 20 00 FF 00 FF 04 06 E1 04 04 00 00 00</w:t>
             </w:r>
           </w:p>
         </w:tc>
@@ -3462,111 +1314,31 @@
       <w:tr>
         <w:tc>
           <w:tcPr>
-            <w:tcW w:type="dxa" w:w="4320"/>
+            <w:tcW w:type="dxa" w:w="2880"/>
           </w:tcPr>
           <w:p>
             <w:r>
-              <w:rPr>
-                <w:sz w:val="20"/>
-              </w:rPr>
-              <w:t>roomNumber</w:t>
+              <w:t>Data received but JSON parse fails</w:t>
             </w:r>
           </w:p>
         </w:tc>
         <w:tc>
           <w:tcPr>
-            <w:tcW w:type="dxa" w:w="4320"/>
+            <w:tcW w:type="dxa" w:w="2880"/>
           </w:tcPr>
           <w:p>
             <w:r>
-              <w:rPr>
-                <w:sz w:val="20"/>
-              </w:rPr>
-              <w:t>101</w:t>
-            </w:r>
-          </w:p>
-        </w:tc>
-      </w:tr>
-      <w:tr>
-        <w:tc>
-          <w:tcPr>
-            <w:tcW w:type="dxa" w:w="4320"/>
-          </w:tcPr>
-          <w:p>
-            <w:r>
-              <w:rPr>
-                <w:sz w:val="20"/>
-              </w:rPr>
-              <w:t>checkIn</w:t>
+              <w:t>Not stripping NDEF header/status byte</w:t>
             </w:r>
           </w:p>
         </w:tc>
         <w:tc>
           <w:tcPr>
-            <w:tcW w:type="dxa" w:w="4320"/>
+            <w:tcW w:type="dxa" w:w="2880"/>
           </w:tcPr>
           <w:p>
             <w:r>
-              <w:rPr>
-                <w:sz w:val="20"/>
-              </w:rPr>
-              <w:t>2026-02-27 14:00</w:t>
-            </w:r>
-          </w:p>
-        </w:tc>
-      </w:tr>
-      <w:tr>
-        <w:tc>
-          <w:tcPr>
-            <w:tcW w:type="dxa" w:w="4320"/>
-          </w:tcPr>
-          <w:p>
-            <w:r>
-              <w:rPr>
-                <w:sz w:val="20"/>
-              </w:rPr>
-              <w:t>checkOut</w:t>
-            </w:r>
-          </w:p>
-        </w:tc>
-        <w:tc>
-          <w:tcPr>
-            <w:tcW w:type="dxa" w:w="4320"/>
-          </w:tcPr>
-          <w:p>
-            <w:r>
-              <w:rPr>
-                <w:sz w:val="20"/>
-              </w:rPr>
-              <w:t>2026-02-28 12:00</w:t>
-            </w:r>
-          </w:p>
-        </w:tc>
-      </w:tr>
-      <w:tr>
-        <w:tc>
-          <w:tcPr>
-            <w:tcW w:type="dxa" w:w="4320"/>
-          </w:tcPr>
-          <w:p>
-            <w:r>
-              <w:rPr>
-                <w:sz w:val="20"/>
-              </w:rPr>
-              <w:t>timestamp</w:t>
-            </w:r>
-          </w:p>
-        </w:tc>
-        <w:tc>
-          <w:tcPr>
-            <w:tcW w:type="dxa" w:w="4320"/>
-          </w:tcPr>
-          <w:p>
-            <w:r>
-              <w:rPr>
-                <w:sz w:val="20"/>
-              </w:rPr>
-              <w:t>1740667200000</w:t>
+              <w:t>Skip NDEF header + status byte + "en" prefix to get JSON</w:t>
             </w:r>
           </w:p>
         </w:tc>
@@ -3945,6 +1717,10 @@
     <w:name w:val="Normal"/>
     <w:qFormat/>
     <w:rsid w:val="00FC693F"/>
+    <w:rPr>
+      <w:rFonts w:ascii="Calibri" w:hAnsi="Calibri"/>
+      <w:sz w:val="22"/>
+    </w:rPr>
   </w:style>
   <w:style w:type="paragraph" w:styleId="Header">
     <w:name w:val="header"/>

</xml_diff>